<commit_message>
done: more dissertation stuff
</commit_message>
<xml_diff>
--- a/Documents/Dissertation.docx
+++ b/Documents/Dissertation.docx
@@ -1483,13 +1483,7 @@
         <w:spacing w:line="240" w:lineRule="auto"/>
       </w:pPr>
       <w:r>
-        <w:t xml:space="preserve">Procedural generation is a game mechanic that has been used in various genres, such as terrain generation in open world adventure games, and </w:t>
-      </w:r>
-      <w:r>
-        <w:t>to</w:t>
-      </w:r>
-      <w:r>
-        <w:t xml:space="preserve"> place game objects in a space. These ways have been successful and have reduced development times for designers once the procedural generation has been implemented. Designing a level can be time consuming in 3D platformers so there is arguably a need for this for some developers. This is where procedural generation is introduced by having the computer create the levels using a set of procedures instead.</w:t>
+        <w:t>Procedural generation is a game mechanic that has been used in various genres, such as terrain generation in open world adventure games, and to place game objects in a space. These ways have been successful and have reduced development times for designers once the procedural generation has been implemented. Designing a level can be time consuming in 3D platformers so there is arguably a need for this for some developers. This is where procedural generation is introduced by having the computer create the levels using a set of procedures instead.</w:t>
       </w:r>
     </w:p>
     <w:p>
@@ -1634,6 +1628,83 @@
         <w:t>2.2.1 Patterns</w:t>
       </w:r>
     </w:p>
+    <w:p>
+      <w:r>
+        <w:t xml:space="preserve">In Level Design Patterns in 2D </w:t>
+      </w:r>
+      <w:proofErr w:type="gramStart"/>
+      <w:r>
+        <w:t>Games</w:t>
+      </w:r>
+      <w:r>
+        <w:t>(</w:t>
+      </w:r>
+      <w:proofErr w:type="gramEnd"/>
+      <w:r>
+        <w:t>ref here)</w:t>
+      </w:r>
+      <w:r>
+        <w:t xml:space="preserve">, it discusses in the introduction that level design </w:t>
+      </w:r>
+      <w:r>
+        <w:t xml:space="preserve">has become a major task in game design which links to how in this project that the point of procedurally generating content is to reduce the demands for game design. This is especially true for games becoming increasingly demanding, which also means the cost </w:t>
+      </w:r>
+      <w:r>
+        <w:lastRenderedPageBreak/>
+        <w:t xml:space="preserve">of creating a game is even higher, therefore using procedural generation in a game reduces the need of hiring more designers due to the demand of level design. </w:t>
+      </w:r>
+    </w:p>
+    <w:p/>
+    <w:p>
+      <w:r>
+        <w:t xml:space="preserve">The article has been effective for level design patterns, especially with the guidance segment, </w:t>
+      </w:r>
+      <w:r>
+        <w:t xml:space="preserve">which can help the player to figure where they might go next. This is important in level design since the player might feel lost of where to go without this mechanic, such as not having a trail of coins go towards where the player needs to go </w:t>
+      </w:r>
+      <w:proofErr w:type="gramStart"/>
+      <w:r>
+        <w:t>next</w:t>
+      </w:r>
+      <w:r>
+        <w:t>, or</w:t>
+      </w:r>
+      <w:proofErr w:type="gramEnd"/>
+      <w:r>
+        <w:t xml:space="preserve"> having an arrow at the checkpoint for where the player needs to go. Pace breaking is also a powerful method for level design since it can dramatically change the parts of a level. For instance, having a lot of smaller jumps/smaller platforms in one part of the level, and then having lots of paths/coins in another segment. Checkpoints and save zones are another form of this, where for example in the application, a checkpoint will </w:t>
+      </w:r>
+      <w:proofErr w:type="gramStart"/>
+      <w:r>
+        <w:t>be located in</w:t>
+      </w:r>
+      <w:proofErr w:type="gramEnd"/>
+      <w:r>
+        <w:t xml:space="preserve"> a platform that is safe for the player so once they reach the checkpoint, they can strategically decide how they will navigate through the next section of the level. </w:t>
+      </w:r>
+    </w:p>
+    <w:p/>
+    <w:p>
+      <w:r>
+        <w:t>2.2.2 Playability</w:t>
+      </w:r>
+    </w:p>
+    <w:p>
+      <w:r>
+        <w:t xml:space="preserve">Procedural Generation of Game Levels and Maps (Ref here) is an article that is too difficult to understand when reading it alone as it might require knowledge of various articles that have been referenced due to its vagueness, which is tricky for developers that might be on a tight deadline. </w:t>
+      </w:r>
+    </w:p>
+    <w:p/>
+    <w:p>
+      <w:r>
+        <w:t xml:space="preserve">When it mentions the constraints about playability however, this is an effective thing to point out since randomly generating a set of platforms with a random distance between them could cause issues with playability such being unable to jump from one platform to another. The project has made sure the level is fully playable by setting certain values for jump gaps, and how much to translate the next platform by based on the jump gap size or the previous platform’s size. The player character also can </w:t>
+      </w:r>
+      <w:r>
+        <w:lastRenderedPageBreak/>
+        <w:t>double jump and run faster to work around issues with the level not being playable.</w:t>
+      </w:r>
+    </w:p>
+    <w:p/>
+    <w:p/>
     <w:p/>
     <w:p>
       <w:pPr>
@@ -2700,6 +2771,7 @@
   <w:style w:type="character" w:default="1" w:styleId="DefaultParagraphFont">
     <w:name w:val="Default Paragraph Font"/>
     <w:uiPriority w:val="1"/>
+    <w:semiHidden/>
     <w:unhideWhenUsed/>
   </w:style>
   <w:style w:type="table" w:default="1" w:styleId="TableNormal">
@@ -3128,7 +3200,12 @@
 </file>
 
 <file path=customXml/item1.xml><?xml version="1.0" encoding="utf-8"?>
-<b:Sources xmlns:b="http://schemas.openxmlformats.org/officeDocument/2006/bibliography" xmlns="http://schemas.openxmlformats.org/officeDocument/2006/bibliography" SelectedStyle="\APA.XSL" StyleName="APA"/>
+<?mso-contentType ?>
+<FormTemplates xmlns="http://schemas.microsoft.com/sharepoint/v3/contenttype/forms">
+  <Display>DocumentLibraryForm</Display>
+  <Edit>DocumentLibraryForm</Edit>
+  <New>DocumentLibraryForm</New>
+</FormTemplates>
 </file>
 
 <file path=customXml/item2.xml><?xml version="1.0" encoding="utf-8"?>
@@ -3138,12 +3215,7 @@
 </file>
 
 <file path=customXml/item3.xml><?xml version="1.0" encoding="utf-8"?>
-<?mso-contentType ?>
-<FormTemplates xmlns="http://schemas.microsoft.com/sharepoint/v3/contenttype/forms">
-  <Display>DocumentLibraryForm</Display>
-  <Edit>DocumentLibraryForm</Edit>
-  <New>DocumentLibraryForm</New>
-</FormTemplates>
+<b:Sources xmlns:b="http://schemas.openxmlformats.org/officeDocument/2006/bibliography" xmlns="http://schemas.openxmlformats.org/officeDocument/2006/bibliography" SelectedStyle="\APA.XSL" StyleName="APA"/>
 </file>
 
 <file path=customXml/item4.xml><?xml version="1.0" encoding="utf-8"?>
@@ -3356,9 +3428,9 @@
 </file>
 
 <file path=customXml/itemProps1.xml><?xml version="1.0" encoding="utf-8"?>
-<ds:datastoreItem xmlns:ds="http://schemas.openxmlformats.org/officeDocument/2006/customXml" ds:itemID="{79CEDF70-F74C-4284-98FC-38644A27E791}">
+<ds:datastoreItem xmlns:ds="http://schemas.openxmlformats.org/officeDocument/2006/customXml" ds:itemID="{05D9BF79-26A9-4E9A-9793-4E28B04A02DC}">
   <ds:schemaRefs>
-    <ds:schemaRef ds:uri="http://schemas.openxmlformats.org/officeDocument/2006/bibliography"/>
+    <ds:schemaRef ds:uri="http://schemas.microsoft.com/sharepoint/v3/contenttype/forms"/>
   </ds:schemaRefs>
 </ds:datastoreItem>
 </file>
@@ -3373,9 +3445,9 @@
 </file>
 
 <file path=customXml/itemProps3.xml><?xml version="1.0" encoding="utf-8"?>
-<ds:datastoreItem xmlns:ds="http://schemas.openxmlformats.org/officeDocument/2006/customXml" ds:itemID="{05D9BF79-26A9-4E9A-9793-4E28B04A02DC}">
+<ds:datastoreItem xmlns:ds="http://schemas.openxmlformats.org/officeDocument/2006/customXml" ds:itemID="{79CEDF70-F74C-4284-98FC-38644A27E791}">
   <ds:schemaRefs>
-    <ds:schemaRef ds:uri="http://schemas.microsoft.com/sharepoint/v3/contenttype/forms"/>
+    <ds:schemaRef ds:uri="http://schemas.openxmlformats.org/officeDocument/2006/bibliography"/>
   </ds:schemaRefs>
 </ds:datastoreItem>
 </file>

</xml_diff>

<commit_message>
added: more lit review stuff
</commit_message>
<xml_diff>
--- a/Documents/Dissertation.docx
+++ b/Documents/Dissertation.docx
@@ -695,7 +695,21 @@
             <w:rStyle w:val="Hyperlink"/>
             <w:noProof/>
           </w:rPr>
-          <w:t>Chapter 2 Literature Review</w:t>
+          <w:t>Chapter 2 Litera</w:t>
+        </w:r>
+        <w:r>
+          <w:rPr>
+            <w:rStyle w:val="Hyperlink"/>
+            <w:noProof/>
+          </w:rPr>
+          <w:t xml:space="preserve">i </w:t>
+        </w:r>
+        <w:r>
+          <w:rPr>
+            <w:rStyle w:val="Hyperlink"/>
+            <w:noProof/>
+          </w:rPr>
+          <w:t>ture Review</w:t>
         </w:r>
         <w:r>
           <w:rPr>
@@ -1617,6 +1631,104 @@
         <w:t>2.1.1 Rhythm-Based PCG</w:t>
       </w:r>
     </w:p>
+    <w:p>
+      <w:r>
+        <w:t xml:space="preserve">In Procedural Level Design for Platform Games (Ref here), it uses a </w:t>
+      </w:r>
+      <w:r>
+        <w:t>four-layer</w:t>
+      </w:r>
+      <w:r>
+        <w:t xml:space="preserve"> hierarchy to represent platform games, with a concentration of repetition, rhythm and connectivity. The idea of rhy</w:t>
+      </w:r>
+      <w:r>
+        <w:t xml:space="preserve">thm is effective here since this allows a level to be created via a set of steps, where for example, the level can start off with “walk 2 seconds”, which means generate a platform that spawns for 2 seconds. Then it might say jump 1 second in, which means make a jump one second into playing the level. </w:t>
+      </w:r>
+      <w:r>
+        <w:t xml:space="preserve">The project uses this example to generate the base level before deciding </w:t>
+      </w:r>
+      <w:r>
+        <w:lastRenderedPageBreak/>
+        <w:t>which platforms will be spawned. It will at least have a set order of which will be a platform, and which parts will be a gap between two platforms to jump, or when the direction changes.</w:t>
+      </w:r>
+    </w:p>
+    <w:p/>
+    <w:p>
+      <w:r>
+        <w:t xml:space="preserve">The article goes on to mention about creating a pattern based on difficulty. This is a great </w:t>
+      </w:r>
+      <w:proofErr w:type="gramStart"/>
+      <w:r>
+        <w:t>start,</w:t>
+      </w:r>
+      <w:proofErr w:type="gramEnd"/>
+      <w:r>
+        <w:t xml:space="preserve"> however this does not make the level feel unique since you are just limiting it to difficulty. Instead, the application has a way to change the likelihood of what will spawn in the level </w:t>
+      </w:r>
+      <w:proofErr w:type="gramStart"/>
+      <w:r>
+        <w:t>in order to</w:t>
+      </w:r>
+      <w:proofErr w:type="gramEnd"/>
+      <w:r>
+        <w:t xml:space="preserve"> allow an adjustment for difficulty, but also to allow for one level with the same difficulty to be completely unique from another level with the same difficulty.</w:t>
+      </w:r>
+    </w:p>
+    <w:p/>
+    <w:p>
+      <w:r>
+        <w:t>The paper mentions a system about monitoring the player’s progress through the level, and the success and failure rates. The application takes some of these ideas and uses a unique method, which is measuring what the player does in the level and then outputting this onto a JSON file.</w:t>
+      </w:r>
+    </w:p>
+    <w:p/>
+    <w:p>
+      <w:r>
+        <w:t>2.1.2 Two Step Constructive Approach</w:t>
+      </w:r>
+    </w:p>
+    <w:p>
+      <w:r>
+        <w:t>In Two Step Constructive Approach for Dungeon Generation</w:t>
+      </w:r>
+      <w:r>
+        <w:t xml:space="preserve"> (ref here), the generation is unfortunately flawed since it uses 9 different algorithms, which unfortunately makes the scope too big for the timeframe of this project. The article does have restrictions of furnishing however, which the project has made use of by </w:t>
+      </w:r>
+      <w:r>
+        <w:t xml:space="preserve">restricting the </w:t>
+      </w:r>
+      <w:proofErr w:type="gramStart"/>
+      <w:r>
+        <w:t>amount</w:t>
+      </w:r>
+      <w:proofErr w:type="gramEnd"/>
+      <w:r>
+        <w:t xml:space="preserve"> of spikes and bounce pads, health packs, and coins a level can have. </w:t>
+      </w:r>
+      <w:r>
+        <w:t>The level also has a limit of one checkpoint per section, and only one goal per level.</w:t>
+      </w:r>
+    </w:p>
+    <w:p/>
+    <w:p>
+      <w:r>
+        <w:t xml:space="preserve">The idea of the two-step generation is also in the application, where the platforms will be generated. After each platform generation, the collectable positions of that platform will be determined if there </w:t>
+      </w:r>
+      <w:proofErr w:type="gramStart"/>
+      <w:r>
+        <w:t>is</w:t>
+      </w:r>
+      <w:proofErr w:type="gramEnd"/>
+      <w:r>
+        <w:t xml:space="preserve"> any collectables. </w:t>
+      </w:r>
+      <w:r>
+        <w:t xml:space="preserve"> </w:t>
+      </w:r>
+      <w:r>
+        <w:t xml:space="preserve">Once every platform has been generated, all the collectables in that section will be generated onto the level. </w:t>
+      </w:r>
+    </w:p>
+    <w:p/>
     <w:p/>
     <w:p>
       <w:r>
@@ -1625,6 +1737,7 @@
     </w:p>
     <w:p>
       <w:r>
+        <w:lastRenderedPageBreak/>
         <w:t>2.2.1 Patterns</w:t>
       </w:r>
     </w:p>
@@ -1647,69 +1760,58 @@
         <w:t xml:space="preserve">, it discusses in the introduction that level design </w:t>
       </w:r>
       <w:r>
-        <w:t xml:space="preserve">has become a major task in game design which links to how in this project that the point of procedurally generating content is to reduce the demands for game design. This is especially true for games becoming increasingly demanding, which also means the cost </w:t>
+        <w:t xml:space="preserve">has become a major task in game design which links to how in this project that the point of procedurally generating content is to reduce the demands for game design. This is especially true for games becoming increasingly demanding, which also means the cost of creating a game is even higher, therefore using procedural generation in a game reduces the need of hiring more designers due to the demand of level design. </w:t>
+      </w:r>
+    </w:p>
+    <w:p/>
+    <w:p>
+      <w:r>
+        <w:t xml:space="preserve">The article has been effective for level design patterns, especially with the guidance segment, </w:t>
+      </w:r>
+      <w:r>
+        <w:t xml:space="preserve">which can help the player to figure where they might go next. This is important in level design since the player might feel lost of where to go without this mechanic, such as not having a trail of coins go towards where the player needs to go </w:t>
+      </w:r>
+      <w:r>
+        <w:t>next or</w:t>
+      </w:r>
+      <w:r>
+        <w:t xml:space="preserve"> having an arrow at the checkpoint for where the player needs to go. Pace breaking is also a powerful method for level design since it can dramatically change the parts of a level. For instance, having a lot of smaller jumps/smaller platforms in one part of the level, and then having lots of paths/coins in another segment. Checkpoints and save zones are another form of this, where for example in the application, a checkpoint will </w:t>
+      </w:r>
+      <w:proofErr w:type="gramStart"/>
+      <w:r>
+        <w:t>be located in</w:t>
+      </w:r>
+      <w:proofErr w:type="gramEnd"/>
+      <w:r>
+        <w:t xml:space="preserve"> a platform that is safe for the player so once they reach the checkpoint, they can strategically decide how they will navigate through the next section of the level. </w:t>
+      </w:r>
+    </w:p>
+    <w:p/>
+    <w:p>
+      <w:r>
+        <w:t>2.2.2 Playability</w:t>
+      </w:r>
+    </w:p>
+    <w:p>
+      <w:r>
+        <w:t xml:space="preserve">Procedural Generation of Game Levels and Maps (Ref here) is an article that is too difficult to understand when reading it alone as it might require knowledge of various articles that have been referenced due to its vagueness, which is tricky for developers that might be on a tight deadline. </w:t>
+      </w:r>
+    </w:p>
+    <w:p/>
+    <w:p>
+      <w:r>
+        <w:t xml:space="preserve">When it mentions the constraints about playability however, this is an effective thing to point out since randomly generating a set of platforms </w:t>
       </w:r>
       <w:r>
         <w:lastRenderedPageBreak/>
-        <w:t xml:space="preserve">of creating a game is even higher, therefore using procedural generation in a game reduces the need of hiring more designers due to the demand of level design. </w:t>
-      </w:r>
-    </w:p>
-    <w:p/>
-    <w:p>
-      <w:r>
-        <w:t xml:space="preserve">The article has been effective for level design patterns, especially with the guidance segment, </w:t>
-      </w:r>
-      <w:r>
-        <w:t xml:space="preserve">which can help the player to figure where they might go next. This is important in level design since the player might feel lost of where to go without this mechanic, such as not having a trail of coins go towards where the player needs to go </w:t>
-      </w:r>
-      <w:proofErr w:type="gramStart"/>
-      <w:r>
-        <w:t>next</w:t>
-      </w:r>
-      <w:r>
-        <w:t>, or</w:t>
-      </w:r>
-      <w:proofErr w:type="gramEnd"/>
-      <w:r>
-        <w:t xml:space="preserve"> having an arrow at the checkpoint for where the player needs to go. Pace breaking is also a powerful method for level design since it can dramatically change the parts of a level. For instance, having a lot of smaller jumps/smaller platforms in one part of the level, and then having lots of paths/coins in another segment. Checkpoints and save zones are another form of this, where for example in the application, a checkpoint will </w:t>
-      </w:r>
-      <w:proofErr w:type="gramStart"/>
-      <w:r>
-        <w:t>be located in</w:t>
-      </w:r>
-      <w:proofErr w:type="gramEnd"/>
-      <w:r>
-        <w:t xml:space="preserve"> a platform that is safe for the player so once they reach the checkpoint, they can strategically decide how they will navigate through the next section of the level. </w:t>
-      </w:r>
-    </w:p>
-    <w:p/>
-    <w:p>
-      <w:r>
-        <w:t>2.2.2 Playability</w:t>
-      </w:r>
-    </w:p>
-    <w:p>
-      <w:r>
-        <w:t xml:space="preserve">Procedural Generation of Game Levels and Maps (Ref here) is an article that is too difficult to understand when reading it alone as it might require knowledge of various articles that have been referenced due to its vagueness, which is tricky for developers that might be on a tight deadline. </w:t>
-      </w:r>
-    </w:p>
-    <w:p/>
-    <w:p>
-      <w:r>
-        <w:t xml:space="preserve">When it mentions the constraints about playability however, this is an effective thing to point out since randomly generating a set of platforms with a random distance between them could cause issues with playability such being unable to jump from one platform to another. The project has made sure the level is fully playable by setting certain values for jump gaps, and how much to translate the next platform by based on the jump gap size or the previous platform’s size. The player character also can </w:t>
-      </w:r>
-      <w:r>
-        <w:lastRenderedPageBreak/>
-        <w:t>double jump and run faster to work around issues with the level not being playable.</w:t>
-      </w:r>
-    </w:p>
-    <w:p/>
+        <w:t>with a random distance between them could cause issues with playability such being unable to jump from one platform to another. The project has made sure the level is fully playable by setting certain values for jump gaps, and how much to translate the next platform by based on the jump gap size or the previous platform’s size. The player character also can double jump and run faster to work around issues with the level not being playable.</w:t>
+      </w:r>
+    </w:p>
     <w:p/>
     <w:p/>
     <w:p>
       <w:pPr>
         <w:pStyle w:val="Heading1"/>
-        <w:jc w:val="center"/>
       </w:pPr>
       <w:r>
         <w:lastRenderedPageBreak/>
@@ -3200,6 +3302,12 @@
 </file>
 
 <file path=customXml/item1.xml><?xml version="1.0" encoding="utf-8"?>
+<p:properties xmlns:p="http://schemas.microsoft.com/office/2006/metadata/properties" xmlns:xsi="http://www.w3.org/2001/XMLSchema-instance" xmlns:pc="http://schemas.microsoft.com/office/infopath/2007/PartnerControls">
+  <documentManagement/>
+</p:properties>
+</file>
+
+<file path=customXml/item2.xml><?xml version="1.0" encoding="utf-8"?>
 <?mso-contentType ?>
 <FormTemplates xmlns="http://schemas.microsoft.com/sharepoint/v3/contenttype/forms">
   <Display>DocumentLibraryForm</Display>
@@ -3208,17 +3316,7 @@
 </FormTemplates>
 </file>
 
-<file path=customXml/item2.xml><?xml version="1.0" encoding="utf-8"?>
-<p:properties xmlns:p="http://schemas.microsoft.com/office/2006/metadata/properties" xmlns:xsi="http://www.w3.org/2001/XMLSchema-instance" xmlns:pc="http://schemas.microsoft.com/office/infopath/2007/PartnerControls">
-  <documentManagement/>
-</p:properties>
-</file>
-
 <file path=customXml/item3.xml><?xml version="1.0" encoding="utf-8"?>
-<b:Sources xmlns:b="http://schemas.openxmlformats.org/officeDocument/2006/bibliography" xmlns="http://schemas.openxmlformats.org/officeDocument/2006/bibliography" SelectedStyle="\APA.XSL" StyleName="APA"/>
-</file>
-
-<file path=customXml/item4.xml><?xml version="1.0" encoding="utf-8"?>
 <ct:contentTypeSchema xmlns:ct="http://schemas.microsoft.com/office/2006/metadata/contentType" xmlns:ma="http://schemas.microsoft.com/office/2006/metadata/properties/metaAttributes" ct:_="" ma:_="" ma:contentTypeName="Document" ma:contentTypeID="0x01010033553FA8616F3A45AD369E275EA42271" ma:contentTypeVersion="11" ma:contentTypeDescription="Create a new document." ma:contentTypeScope="" ma:versionID="8eb4e0804d077bcc139b361cda3a640c">
   <xsd:schema xmlns:xsd="http://www.w3.org/2001/XMLSchema" xmlns:xs="http://www.w3.org/2001/XMLSchema" xmlns:p="http://schemas.microsoft.com/office/2006/metadata/properties" xmlns:ns3="371a10d4-9e19-41a9-948b-d1cca29b4cb6" xmlns:ns4="18dffc30-a361-43f0-bb4a-1f62e819a6f2" targetNamespace="http://schemas.microsoft.com/office/2006/metadata/properties" ma:root="true" ma:fieldsID="ac8e08ff64368403dfb4d2274f8d7465" ns3:_="" ns4:_="">
     <xsd:import namespace="371a10d4-9e19-41a9-948b-d1cca29b4cb6"/>
@@ -3427,15 +3525,11 @@
 </ct:contentTypeSchema>
 </file>
 
-<file path=customXml/itemProps1.xml><?xml version="1.0" encoding="utf-8"?>
-<ds:datastoreItem xmlns:ds="http://schemas.openxmlformats.org/officeDocument/2006/customXml" ds:itemID="{05D9BF79-26A9-4E9A-9793-4E28B04A02DC}">
-  <ds:schemaRefs>
-    <ds:schemaRef ds:uri="http://schemas.microsoft.com/sharepoint/v3/contenttype/forms"/>
-  </ds:schemaRefs>
-</ds:datastoreItem>
+<file path=customXml/item4.xml><?xml version="1.0" encoding="utf-8"?>
+<b:Sources xmlns:b="http://schemas.openxmlformats.org/officeDocument/2006/bibliography" xmlns="http://schemas.openxmlformats.org/officeDocument/2006/bibliography" SelectedStyle="\APA.XSL" StyleName="APA"/>
 </file>
 
-<file path=customXml/itemProps2.xml><?xml version="1.0" encoding="utf-8"?>
+<file path=customXml/itemProps1.xml><?xml version="1.0" encoding="utf-8"?>
 <ds:datastoreItem xmlns:ds="http://schemas.openxmlformats.org/officeDocument/2006/customXml" ds:itemID="{10A8F88B-6E38-47A8-8074-155E10D59BDF}">
   <ds:schemaRefs>
     <ds:schemaRef ds:uri="http://schemas.microsoft.com/office/2006/metadata/properties"/>
@@ -3444,15 +3538,15 @@
 </ds:datastoreItem>
 </file>
 
-<file path=customXml/itemProps3.xml><?xml version="1.0" encoding="utf-8"?>
-<ds:datastoreItem xmlns:ds="http://schemas.openxmlformats.org/officeDocument/2006/customXml" ds:itemID="{79CEDF70-F74C-4284-98FC-38644A27E791}">
+<file path=customXml/itemProps2.xml><?xml version="1.0" encoding="utf-8"?>
+<ds:datastoreItem xmlns:ds="http://schemas.openxmlformats.org/officeDocument/2006/customXml" ds:itemID="{05D9BF79-26A9-4E9A-9793-4E28B04A02DC}">
   <ds:schemaRefs>
-    <ds:schemaRef ds:uri="http://schemas.openxmlformats.org/officeDocument/2006/bibliography"/>
+    <ds:schemaRef ds:uri="http://schemas.microsoft.com/sharepoint/v3/contenttype/forms"/>
   </ds:schemaRefs>
 </ds:datastoreItem>
 </file>
 
-<file path=customXml/itemProps4.xml><?xml version="1.0" encoding="utf-8"?>
+<file path=customXml/itemProps3.xml><?xml version="1.0" encoding="utf-8"?>
 <ds:datastoreItem xmlns:ds="http://schemas.openxmlformats.org/officeDocument/2006/customXml" ds:itemID="{307A6BE8-0D48-4A7D-A535-369CCDFBF2CB}">
   <ds:schemaRefs>
     <ds:schemaRef ds:uri="http://schemas.microsoft.com/office/2006/metadata/contentType"/>
@@ -3469,4 +3563,12 @@
     <ds:schemaRef ds:uri="http://schemas.microsoft.com/internal/obd"/>
   </ds:schemaRefs>
 </ds:datastoreItem>
+</file>
+
+<file path=customXml/itemProps4.xml><?xml version="1.0" encoding="utf-8"?>
+<ds:datastoreItem xmlns:ds="http://schemas.openxmlformats.org/officeDocument/2006/customXml" ds:itemID="{79CEDF70-F74C-4284-98FC-38644A27E791}">
+  <ds:schemaRefs>
+    <ds:schemaRef ds:uri="http://schemas.openxmlformats.org/officeDocument/2006/bibliography"/>
+  </ds:schemaRefs>
+</ds:datastoreItem>
 </file>
</xml_diff>

<commit_message>
commit: more lit review stuff
</commit_message>
<xml_diff>
--- a/Documents/Dissertation.docx
+++ b/Documents/Dissertation.docx
@@ -1388,15 +1388,7 @@
         <w:t xml:space="preserve">and </w:t>
       </w:r>
       <w:r>
-        <w:t xml:space="preserve">information outputted after the level will be employed to evaluate the effectiveness of this project. </w:t>
-      </w:r>
-      <w:proofErr w:type="gramStart"/>
-      <w:r>
-        <w:t>Participants  will</w:t>
-      </w:r>
-      <w:proofErr w:type="gramEnd"/>
-      <w:r>
-        <w:t xml:space="preserve"> test a generated level and will fill out a questionnaire regarding feedback on what they experienced.</w:t>
+        <w:t>information outputted after the level will be employed to evaluate the effectiveness of this project. Participants  will test a generated level and will fill out a questionnaire regarding feedback on what they experienced.</w:t>
       </w:r>
     </w:p>
     <w:p/>
@@ -1633,16 +1625,7 @@
     </w:p>
     <w:p>
       <w:r>
-        <w:t xml:space="preserve">In Procedural Level Design for Platform Games (Ref here), it uses a </w:t>
-      </w:r>
-      <w:r>
-        <w:t>four-layer</w:t>
-      </w:r>
-      <w:r>
-        <w:t xml:space="preserve"> hierarchy to represent platform games, with a concentration of repetition, rhythm and connectivity. The idea of rhy</w:t>
-      </w:r>
-      <w:r>
-        <w:t xml:space="preserve">thm is effective here since this allows a level to be created via a set of steps, where for example, the level can start off with “walk 2 seconds”, which means generate a platform that spawns for 2 seconds. Then it might say jump 1 second in, which means make a jump one second into playing the level. </w:t>
+        <w:t xml:space="preserve">In Procedural Level Design for Platform Games (Ref here), it uses a four-layer hierarchy to represent platform games, with a concentration of repetition, rhythm and connectivity. The idea of rhythm is effective here since this allows a level to be created via a set of steps, where for example, the level can start off with “walk 2 seconds”, which means generate a platform that spawns for 2 seconds. Then it might say jump 1 second in, which means make a jump one second into playing the level. </w:t>
       </w:r>
       <w:r>
         <w:t xml:space="preserve">The project uses this example to generate the base level before deciding </w:t>
@@ -1655,23 +1638,7 @@
     <w:p/>
     <w:p>
       <w:r>
-        <w:t xml:space="preserve">The article goes on to mention about creating a pattern based on difficulty. This is a great </w:t>
-      </w:r>
-      <w:proofErr w:type="gramStart"/>
-      <w:r>
-        <w:t>start,</w:t>
-      </w:r>
-      <w:proofErr w:type="gramEnd"/>
-      <w:r>
-        <w:t xml:space="preserve"> however this does not make the level feel unique since you are just limiting it to difficulty. Instead, the application has a way to change the likelihood of what will spawn in the level </w:t>
-      </w:r>
-      <w:proofErr w:type="gramStart"/>
-      <w:r>
-        <w:t>in order to</w:t>
-      </w:r>
-      <w:proofErr w:type="gramEnd"/>
-      <w:r>
-        <w:t xml:space="preserve"> allow an adjustment for difficulty, but also to allow for one level with the same difficulty to be completely unique from another level with the same difficulty.</w:t>
+        <w:t>The article goes on to mention about creating a pattern based on difficulty. This is a great start, however this does not make the level feel unique since you are just limiting it to difficulty. Instead, the application has a way to change the likelihood of what will spawn in the level in order to allow an adjustment for difficulty, but also to allow for one level with the same difficulty to be completely unique from another level with the same difficulty.</w:t>
       </w:r>
     </w:p>
     <w:p/>
@@ -1694,15 +1661,7 @@
         <w:t xml:space="preserve"> (ref here), the generation is unfortunately flawed since it uses 9 different algorithms, which unfortunately makes the scope too big for the timeframe of this project. The article does have restrictions of furnishing however, which the project has made use of by </w:t>
       </w:r>
       <w:r>
-        <w:t xml:space="preserve">restricting the </w:t>
-      </w:r>
-      <w:proofErr w:type="gramStart"/>
-      <w:r>
-        <w:t>amount</w:t>
-      </w:r>
-      <w:proofErr w:type="gramEnd"/>
-      <w:r>
-        <w:t xml:space="preserve"> of spikes and bounce pads, health packs, and coins a level can have. </w:t>
+        <w:t xml:space="preserve">restricting the amount of spikes and bounce pads, health packs, and coins a level can have. </w:t>
       </w:r>
       <w:r>
         <w:t>The level also has a limit of one checkpoint per section, and only one goal per level.</w:t>
@@ -1711,15 +1670,7 @@
     <w:p/>
     <w:p>
       <w:r>
-        <w:t xml:space="preserve">The idea of the two-step generation is also in the application, where the platforms will be generated. After each platform generation, the collectable positions of that platform will be determined if there </w:t>
-      </w:r>
-      <w:proofErr w:type="gramStart"/>
-      <w:r>
-        <w:t>is</w:t>
-      </w:r>
-      <w:proofErr w:type="gramEnd"/>
-      <w:r>
-        <w:t xml:space="preserve"> any collectables. </w:t>
+        <w:t xml:space="preserve">The idea of the two-step generation is also in the application, where the platforms will be generated. After each platform generation, the collectable positions of that platform will be determined if there is any collectables. </w:t>
       </w:r>
       <w:r>
         <w:t xml:space="preserve"> </w:t>
@@ -1727,7 +1678,106 @@
       <w:r>
         <w:t xml:space="preserve">Once every platform has been generated, all the collectables in that section will be generated onto the level. </w:t>
       </w:r>
-    </w:p>
+      <w:r>
+        <w:t xml:space="preserve"> </w:t>
+      </w:r>
+    </w:p>
+    <w:p/>
+    <w:p>
+      <w:r>
+        <w:t xml:space="preserve">2.1.3 </w:t>
+      </w:r>
+      <w:r>
+        <w:t>Newer and Improved Procedural Content</w:t>
+      </w:r>
+      <w:r>
+        <w:t xml:space="preserve"> Generation</w:t>
+      </w:r>
+    </w:p>
+    <w:p/>
+    <w:p/>
+    <w:p>
+      <w:r>
+        <w:t xml:space="preserve">The article has the same goal as this project, which is to save development times while still making the level feel engaging for players. </w:t>
+      </w:r>
+    </w:p>
+    <w:p>
+      <w:r>
+        <w:t xml:space="preserve">The abstract mentions that the algorithm has the potential to streamline game development processes, while it is still maintaining high quality content generation. However, to begin with stating the algorithm is still maintaining high quality content generation without stating there is evidence for this in the abstract might result in the reader believing that this is not backed up effectively if they were to look at the abstract as a summary of this paper. </w:t>
+      </w:r>
+    </w:p>
+    <w:p/>
+    <w:p>
+      <w:r>
+        <w:t>The paper describes that high quality games usually require manual generation and significant effort by a large team which includes designers and developers, which is expensive budget wise and can be time consuming. This links to the objective of this project, which is to procedurally generate 3D platformer levels to reduce the demand for designers and to reduce development time in terms of level design, and this in turn saves money for the company.</w:t>
+      </w:r>
+    </w:p>
+    <w:p/>
+    <w:p>
+      <w:commentRangeStart w:id="7"/>
+      <w:r>
+        <w:t xml:space="preserve">It states an advantage of procedural generation, which is that it can reduce the disk capacity of the final game dramatically since the content that is generated throughout the game is created on the fly. For example, in the application, when the player reaches a checkpoint, the content generated is determined just when the player touches the checkpoint, rather than generating it all at the start or before run time. This is effective for reducing compile times at the start since there isn’t as many assets to load at the beginning, and there isn’t any need to store the level itself in the game’s files, thus saving storage space. </w:t>
+      </w:r>
+      <w:commentRangeEnd w:id="7"/>
+      <w:r>
+        <w:rPr>
+          <w:rStyle w:val="CommentReference"/>
+          <w:sz w:val="24"/>
+          <w:szCs w:val="24"/>
+        </w:rPr>
+        <w:commentReference w:id="7"/>
+      </w:r>
+    </w:p>
+    <w:p/>
+    <w:p/>
+    <w:p>
+      <w:r>
+        <w:t xml:space="preserve">The paper also states the disadvantage of procedural generation taken more processing power before the game loads but also mentions that this is better than having a larger file size for the game. However, the application does combat this by only generating one section of the level </w:t>
+      </w:r>
+      <w:r>
+        <w:lastRenderedPageBreak/>
+        <w:t xml:space="preserve">at the start. Each section gets generated when the player hits a checkpoint, which dramatically decreases the computational power needed for each generation. </w:t>
+      </w:r>
+    </w:p>
+    <w:p/>
+    <w:p>
+      <w:r>
+        <w:t>The article mentions that some methods generate the content during the loading phase, while others will be generated dynamically during gameplay. The application has taken both ideas, where the first section will be generated during the loading phase, and the overall generation attributes and parameters will be determined at the start. The rest of the sections will be generated dynamically based on these attributes and parameters.</w:t>
+      </w:r>
+    </w:p>
+    <w:p/>
+    <w:p>
+      <w:r>
+        <w:t xml:space="preserve">The paper states methods that procedural generation uses, it states Markov is a procedural generation method that is fast. This is used when determining which platform can be spawned in the level, and if there should be a direction change for example. This is also used for other attributes such as when generating a bounce pad in the level. </w:t>
+      </w:r>
+    </w:p>
+    <w:p>
+      <w:r>
+        <w:t>The paper does state that some machine learning methods, such as generative adversial networks is not a suitable method since it takes up too much computational power, which is not suited for real time content generation. I believe this effective since the paper is not afraid to mention flaws about procedural generation methods, which allows researchers to ensure they are making the right decisions when utilising procedural generation in their application.</w:t>
+      </w:r>
+    </w:p>
+    <w:p/>
+    <w:p>
+      <w:r>
+        <w:t>It has mentioned a procedural generation technique regarding difficulty in a level. If there were not time constraints with the development times of the project, this idea by determining the difficulty to use when reaching a checkpoint would be used. If the player successfully got a high score (e.g. lots of coins, fast time, no deaths), the difficulty would be harder.</w:t>
+      </w:r>
+    </w:p>
+    <w:p/>
+    <w:p>
+      <w:r>
+        <w:t xml:space="preserve">The article mentions that many games lack variety in terms of levels, which means the player can recognise patterns. It’s effective the article mentions this since for example, once you complete a video game, there </w:t>
+      </w:r>
+      <w:r>
+        <w:lastRenderedPageBreak/>
+        <w:t xml:space="preserve">isn’t much in terms of replayability for the level layouts changing for example. </w:t>
+      </w:r>
+    </w:p>
+    <w:p>
+      <w:r>
+        <w:t>The article ensures to mention that rules are required to prevent softlocks, such as with the improved spawn algorithm where special attention is given to the fact that all entrances cannot face any wall side, as a minimum distance from it is estimated. This is effective since the application also has some rules to prevent soft locks to name specific jump gaps and predefined platform sizes.</w:t>
+      </w:r>
+    </w:p>
+    <w:p/>
     <w:p/>
     <w:p/>
     <w:p>
@@ -1737,53 +1787,40 @@
     </w:p>
     <w:p>
       <w:r>
+        <w:t>2.2.1 Patterns</w:t>
+      </w:r>
+    </w:p>
+    <w:p>
+      <w:r>
+        <w:t>In Level Design Patterns in 2D Games</w:t>
+      </w:r>
+      <w:r>
+        <w:t>(ref here)</w:t>
+      </w:r>
+      <w:r>
+        <w:t xml:space="preserve">, it discusses in the introduction that level design </w:t>
+      </w:r>
+      <w:r>
+        <w:t xml:space="preserve">has become a major task in game design which links to how in this project that the point of procedurally generating content is to reduce the demands for game design. This is especially true for games becoming increasingly demanding, which also means the cost of creating a game is even higher, therefore using procedural generation in a game reduces the need of hiring more designers due to the demand of level design. </w:t>
+      </w:r>
+    </w:p>
+    <w:p/>
+    <w:p>
+      <w:r>
+        <w:t xml:space="preserve">The article has been effective for level design patterns, especially with the guidance segment, </w:t>
+      </w:r>
+      <w:r>
+        <w:t xml:space="preserve">which can help the player to figure where they might go next. This is important in level design since the player might feel lost of where to go without this mechanic, such as not having a trail of coins go towards where the player needs to go </w:t>
+      </w:r>
+      <w:r>
+        <w:t>next or</w:t>
+      </w:r>
+      <w:r>
+        <w:t xml:space="preserve"> having an arrow at the checkpoint for where the player needs to go. Pace breaking is also a powerful method for level design since it can dramatically change the parts of a level. For instance, having a lot of smaller jumps/smaller platforms in one part of the level, and then having lots of paths/coins in another segment. Checkpoints and save zones are another form of this, where for example in the application, a checkpoint will be located in a platform that is safe for the player so once they reach the checkpoint, </w:t>
+      </w:r>
+      <w:r>
         <w:lastRenderedPageBreak/>
-        <w:t>2.2.1 Patterns</w:t>
-      </w:r>
-    </w:p>
-    <w:p>
-      <w:r>
-        <w:t xml:space="preserve">In Level Design Patterns in 2D </w:t>
-      </w:r>
-      <w:proofErr w:type="gramStart"/>
-      <w:r>
-        <w:t>Games</w:t>
-      </w:r>
-      <w:r>
-        <w:t>(</w:t>
-      </w:r>
-      <w:proofErr w:type="gramEnd"/>
-      <w:r>
-        <w:t>ref here)</w:t>
-      </w:r>
-      <w:r>
-        <w:t xml:space="preserve">, it discusses in the introduction that level design </w:t>
-      </w:r>
-      <w:r>
-        <w:t xml:space="preserve">has become a major task in game design which links to how in this project that the point of procedurally generating content is to reduce the demands for game design. This is especially true for games becoming increasingly demanding, which also means the cost of creating a game is even higher, therefore using procedural generation in a game reduces the need of hiring more designers due to the demand of level design. </w:t>
-      </w:r>
-    </w:p>
-    <w:p/>
-    <w:p>
-      <w:r>
-        <w:t xml:space="preserve">The article has been effective for level design patterns, especially with the guidance segment, </w:t>
-      </w:r>
-      <w:r>
-        <w:t xml:space="preserve">which can help the player to figure where they might go next. This is important in level design since the player might feel lost of where to go without this mechanic, such as not having a trail of coins go towards where the player needs to go </w:t>
-      </w:r>
-      <w:r>
-        <w:t>next or</w:t>
-      </w:r>
-      <w:r>
-        <w:t xml:space="preserve"> having an arrow at the checkpoint for where the player needs to go. Pace breaking is also a powerful method for level design since it can dramatically change the parts of a level. For instance, having a lot of smaller jumps/smaller platforms in one part of the level, and then having lots of paths/coins in another segment. Checkpoints and save zones are another form of this, where for example in the application, a checkpoint will </w:t>
-      </w:r>
-      <w:proofErr w:type="gramStart"/>
-      <w:r>
-        <w:t>be located in</w:t>
-      </w:r>
-      <w:proofErr w:type="gramEnd"/>
-      <w:r>
-        <w:t xml:space="preserve"> a platform that is safe for the player so once they reach the checkpoint, they can strategically decide how they will navigate through the next section of the level. </w:t>
+        <w:t xml:space="preserve">they can strategically decide how they will navigate through the next section of the level. </w:t>
       </w:r>
     </w:p>
     <w:p/>
@@ -1800,11 +1837,7 @@
     <w:p/>
     <w:p>
       <w:r>
-        <w:t xml:space="preserve">When it mentions the constraints about playability however, this is an effective thing to point out since randomly generating a set of platforms </w:t>
-      </w:r>
-      <w:r>
-        <w:lastRenderedPageBreak/>
-        <w:t>with a random distance between them could cause issues with playability such being unable to jump from one platform to another. The project has made sure the level is fully playable by setting certain values for jump gaps, and how much to translate the next platform by based on the jump gap size or the previous platform’s size. The player character also can double jump and run faster to work around issues with the level not being playable.</w:t>
+        <w:t>When it mentions the constraints about playability however, this is an effective thing to point out since randomly generating a set of platforms with a random distance between them could cause issues with playability such being unable to jump from one platform to another. The project has made sure the level is fully playable by setting certain values for jump gaps, and how much to translate the next platform by based on the jump gap size or the previous platform’s size. The player character also can double jump and run faster to work around issues with the level not being playable.</w:t>
       </w:r>
     </w:p>
     <w:p/>
@@ -1824,7 +1857,7 @@
         <w:pStyle w:val="Heading1"/>
         <w:jc w:val="center"/>
       </w:pPr>
-      <w:bookmarkStart w:id="7" w:name="_Toc92987354"/>
+      <w:bookmarkStart w:id="8" w:name="_Toc92987354"/>
       <w:r>
         <w:lastRenderedPageBreak/>
         <w:t>Chapter 3</w:t>
@@ -1832,7 +1865,7 @@
       <w:r>
         <w:t xml:space="preserve"> Methodology</w:t>
       </w:r>
-      <w:bookmarkEnd w:id="7"/>
+      <w:bookmarkEnd w:id="8"/>
       <w:r>
         <w:br w:type="page"/>
       </w:r>
@@ -1842,7 +1875,7 @@
         <w:pStyle w:val="Heading1"/>
         <w:jc w:val="center"/>
       </w:pPr>
-      <w:bookmarkStart w:id="8" w:name="_Toc92987355"/>
+      <w:bookmarkStart w:id="9" w:name="_Toc92987355"/>
       <w:r>
         <w:lastRenderedPageBreak/>
         <w:t>Chapter 4</w:t>
@@ -1850,7 +1883,7 @@
       <w:r>
         <w:t xml:space="preserve"> Results</w:t>
       </w:r>
-      <w:bookmarkEnd w:id="8"/>
+      <w:bookmarkEnd w:id="9"/>
       <w:r>
         <w:br w:type="page"/>
       </w:r>
@@ -1860,7 +1893,7 @@
         <w:pStyle w:val="Heading1"/>
         <w:jc w:val="center"/>
       </w:pPr>
-      <w:bookmarkStart w:id="9" w:name="_Toc92987356"/>
+      <w:bookmarkStart w:id="10" w:name="_Toc92987356"/>
       <w:r>
         <w:lastRenderedPageBreak/>
         <w:t>Chapter 5</w:t>
@@ -1868,7 +1901,7 @@
       <w:r>
         <w:t xml:space="preserve"> Discussion</w:t>
       </w:r>
-      <w:bookmarkEnd w:id="9"/>
+      <w:bookmarkEnd w:id="10"/>
       <w:r>
         <w:br w:type="page"/>
       </w:r>
@@ -1878,7 +1911,7 @@
         <w:pStyle w:val="Heading1"/>
         <w:jc w:val="center"/>
       </w:pPr>
-      <w:bookmarkStart w:id="10" w:name="_Toc92987357"/>
+      <w:bookmarkStart w:id="11" w:name="_Toc92987357"/>
       <w:r>
         <w:lastRenderedPageBreak/>
         <w:t>Chapter 6</w:t>
@@ -1892,7 +1925,7 @@
       <w:r>
         <w:t>uture Work</w:t>
       </w:r>
-      <w:bookmarkEnd w:id="10"/>
+      <w:bookmarkEnd w:id="11"/>
       <w:r>
         <w:br w:type="page"/>
       </w:r>
@@ -1901,12 +1934,12 @@
       <w:pPr>
         <w:pStyle w:val="Heading1"/>
       </w:pPr>
-      <w:bookmarkStart w:id="11" w:name="_Toc92987358"/>
+      <w:bookmarkStart w:id="12" w:name="_Toc92987358"/>
       <w:r>
         <w:lastRenderedPageBreak/>
         <w:t>List of References</w:t>
       </w:r>
-      <w:bookmarkEnd w:id="11"/>
+      <w:bookmarkEnd w:id="12"/>
     </w:p>
     <w:p>
       <w:pPr>
@@ -1915,20 +1948,20 @@
       <w:r>
         <w:br w:type="page"/>
       </w:r>
-      <w:bookmarkStart w:id="12" w:name="_Toc92987359"/>
-      <w:bookmarkStart w:id="13" w:name="_Toc447628191"/>
+      <w:bookmarkStart w:id="13" w:name="_Toc92987359"/>
+      <w:bookmarkStart w:id="14" w:name="_Toc447628191"/>
       <w:r>
         <w:lastRenderedPageBreak/>
         <w:t>Bibliography</w:t>
       </w:r>
-      <w:bookmarkEnd w:id="12"/>
+      <w:bookmarkEnd w:id="13"/>
     </w:p>
     <w:p>
       <w:r>
         <w:t>If required</w:t>
       </w:r>
     </w:p>
-    <w:bookmarkEnd w:id="13"/>
+    <w:bookmarkEnd w:id="14"/>
     <w:p/>
     <w:p>
       <w:pPr>
@@ -1943,20 +1976,20 @@
       <w:pPr>
         <w:pStyle w:val="Heading1"/>
       </w:pPr>
-      <w:bookmarkStart w:id="14" w:name="_Toc92987360"/>
+      <w:bookmarkStart w:id="15" w:name="_Toc92987360"/>
       <w:r>
         <w:lastRenderedPageBreak/>
         <w:t>Appendices</w:t>
       </w:r>
-      <w:bookmarkEnd w:id="14"/>
+      <w:bookmarkEnd w:id="15"/>
       <w:r>
         <w:t xml:space="preserve"> </w:t>
       </w:r>
     </w:p>
     <w:p/>
     <w:sectPr>
-      <w:headerReference w:type="default" r:id="rId14"/>
-      <w:footerReference w:type="default" r:id="rId15"/>
+      <w:headerReference w:type="default" r:id="rId18"/>
+      <w:footerReference w:type="default" r:id="rId19"/>
       <w:pgSz w:w="11906" w:h="16838"/>
       <w:pgMar w:top="1440" w:right="1797" w:bottom="1440" w:left="2268" w:header="720" w:footer="720" w:gutter="0"/>
       <w:pgNumType w:start="1"/>
@@ -1965,6 +1998,48 @@
     </w:sectPr>
   </w:body>
 </w:document>
+</file>
+
+<file path=word/comments.xml><?xml version="1.0" encoding="utf-8"?>
+<w:comments xmlns:wpc="http://schemas.microsoft.com/office/word/2010/wordprocessingCanvas" xmlns:cx="http://schemas.microsoft.com/office/drawing/2014/chartex" xmlns:cx1="http://schemas.microsoft.com/office/drawing/2015/9/8/chartex" xmlns:cx2="http://schemas.microsoft.com/office/drawing/2015/10/21/chartex" xmlns:cx3="http://schemas.microsoft.com/office/drawing/2016/5/9/chartex" xmlns:cx4="http://schemas.microsoft.com/office/drawing/2016/5/10/chartex" xmlns:cx5="http://schemas.microsoft.com/office/drawing/2016/5/11/chartex" xmlns:cx6="http://schemas.microsoft.com/office/drawing/2016/5/12/chartex" xmlns:cx7="http://schemas.microsoft.com/office/drawing/2016/5/13/chartex" xmlns:cx8="http://schemas.microsoft.com/office/drawing/2016/5/14/chartex" xmlns:mc="http://schemas.openxmlformats.org/markup-compatibility/2006" xmlns:aink="http://schemas.microsoft.com/office/drawing/2016/ink" xmlns:am3d="http://schemas.microsoft.com/office/drawing/2017/model3d" xmlns:o="urn:schemas-microsoft-com:office:office" xmlns:oel="http://schemas.microsoft.com/office/2019/extlst" xmlns:r="http://schemas.openxmlformats.org/officeDocument/2006/relationships" xmlns:m="http://schemas.openxmlformats.org/officeDocument/2006/math" xmlns:v="urn:schemas-microsoft-com:vml" xmlns:wp14="http://schemas.microsoft.com/office/word/2010/wordprocessingDrawing" xmlns:wp="http://schemas.openxmlformats.org/drawingml/2006/wordprocessingDrawing" xmlns:w10="urn:schemas-microsoft-com:office:word" xmlns:w="http://schemas.openxmlformats.org/wordprocessingml/2006/main" xmlns:w14="http://schemas.microsoft.com/office/word/2010/wordml" xmlns:w15="http://schemas.microsoft.com/office/word/2012/wordml" xmlns:w16cex="http://schemas.microsoft.com/office/word/2018/wordml/cex" xmlns:w16cid="http://schemas.microsoft.com/office/word/2016/wordml/cid" xmlns:w16="http://schemas.microsoft.com/office/word/2018/wordml" xmlns:w16du="http://schemas.microsoft.com/office/word/2023/wordml/word16du" xmlns:w16sdtdh="http://schemas.microsoft.com/office/word/2020/wordml/sdtdatahash" xmlns:w16sdtfl="http://schemas.microsoft.com/office/word/2024/wordml/sdtformatlock" xmlns:w16se="http://schemas.microsoft.com/office/word/2015/wordml/symex" xmlns:wpg="http://schemas.microsoft.com/office/word/2010/wordprocessingGroup" xmlns:wpi="http://schemas.microsoft.com/office/word/2010/wordprocessingInk" xmlns:wne="http://schemas.microsoft.com/office/word/2006/wordml" xmlns:wps="http://schemas.microsoft.com/office/word/2010/wordprocessingShape" mc:Ignorable="w14 w15 w16se w16cid w16 w16cex w16sdtdh w16sdtfl w16du wp14">
+  <w:comment w:id="7" w:author="Jerry" w:date="2026-03-28T17:02:00Z" w:initials="J">
+    <w:p>
+      <w:pPr>
+        <w:pStyle w:val="CommentText"/>
+      </w:pPr>
+      <w:r>
+        <w:rPr>
+          <w:rStyle w:val="CommentReference"/>
+        </w:rPr>
+        <w:annotationRef/>
+      </w:r>
+      <w:r>
+        <w:rPr>
+          <w:lang w:val="en-US"/>
+        </w:rPr>
+        <w:t>Try to make this less waffle-ly</w:t>
+      </w:r>
+    </w:p>
+  </w:comment>
+</w:comments>
+</file>
+
+<file path=word/commentsExtended.xml><?xml version="1.0" encoding="utf-8"?>
+<w15:commentsEx xmlns:wpc="http://schemas.microsoft.com/office/word/2010/wordprocessingCanvas" xmlns:cx="http://schemas.microsoft.com/office/drawing/2014/chartex" xmlns:cx1="http://schemas.microsoft.com/office/drawing/2015/9/8/chartex" xmlns:cx2="http://schemas.microsoft.com/office/drawing/2015/10/21/chartex" xmlns:cx3="http://schemas.microsoft.com/office/drawing/2016/5/9/chartex" xmlns:cx4="http://schemas.microsoft.com/office/drawing/2016/5/10/chartex" xmlns:cx5="http://schemas.microsoft.com/office/drawing/2016/5/11/chartex" xmlns:cx6="http://schemas.microsoft.com/office/drawing/2016/5/12/chartex" xmlns:cx7="http://schemas.microsoft.com/office/drawing/2016/5/13/chartex" xmlns:cx8="http://schemas.microsoft.com/office/drawing/2016/5/14/chartex" xmlns:mc="http://schemas.openxmlformats.org/markup-compatibility/2006" xmlns:aink="http://schemas.microsoft.com/office/drawing/2016/ink" xmlns:am3d="http://schemas.microsoft.com/office/drawing/2017/model3d" xmlns:o="urn:schemas-microsoft-com:office:office" xmlns:oel="http://schemas.microsoft.com/office/2019/extlst" xmlns:r="http://schemas.openxmlformats.org/officeDocument/2006/relationships" xmlns:m="http://schemas.openxmlformats.org/officeDocument/2006/math" xmlns:v="urn:schemas-microsoft-com:vml" xmlns:wp14="http://schemas.microsoft.com/office/word/2010/wordprocessingDrawing" xmlns:wp="http://schemas.openxmlformats.org/drawingml/2006/wordprocessingDrawing" xmlns:w10="urn:schemas-microsoft-com:office:word" xmlns:w="http://schemas.openxmlformats.org/wordprocessingml/2006/main" xmlns:w14="http://schemas.microsoft.com/office/word/2010/wordml" xmlns:w15="http://schemas.microsoft.com/office/word/2012/wordml" xmlns:w16cex="http://schemas.microsoft.com/office/word/2018/wordml/cex" xmlns:w16cid="http://schemas.microsoft.com/office/word/2016/wordml/cid" xmlns:w16="http://schemas.microsoft.com/office/word/2018/wordml" xmlns:w16du="http://schemas.microsoft.com/office/word/2023/wordml/word16du" xmlns:w16sdtdh="http://schemas.microsoft.com/office/word/2020/wordml/sdtdatahash" xmlns:w16sdtfl="http://schemas.microsoft.com/office/word/2024/wordml/sdtformatlock" xmlns:w16se="http://schemas.microsoft.com/office/word/2015/wordml/symex" xmlns:wpg="http://schemas.microsoft.com/office/word/2010/wordprocessingGroup" xmlns:wpi="http://schemas.microsoft.com/office/word/2010/wordprocessingInk" xmlns:wne="http://schemas.microsoft.com/office/word/2006/wordml" xmlns:wps="http://schemas.microsoft.com/office/word/2010/wordprocessingShape" mc:Ignorable="w14 w15 w16se w16cid w16 w16cex w16sdtdh w16sdtfl w16du wp14">
+  <w15:commentEx w15:paraId="44E31EEA" w15:done="0"/>
+</w15:commentsEx>
+</file>
+
+<file path=word/commentsExtensible.xml><?xml version="1.0" encoding="utf-8"?>
+<w16cex:commentsExtensible xmlns:wpc="http://schemas.microsoft.com/office/word/2010/wordprocessingCanvas" xmlns:cx="http://schemas.microsoft.com/office/drawing/2014/chartex" xmlns:cx1="http://schemas.microsoft.com/office/drawing/2015/9/8/chartex" xmlns:cx2="http://schemas.microsoft.com/office/drawing/2015/10/21/chartex" xmlns:cx3="http://schemas.microsoft.com/office/drawing/2016/5/9/chartex" xmlns:cx4="http://schemas.microsoft.com/office/drawing/2016/5/10/chartex" xmlns:cx5="http://schemas.microsoft.com/office/drawing/2016/5/11/chartex" xmlns:cx6="http://schemas.microsoft.com/office/drawing/2016/5/12/chartex" xmlns:cx7="http://schemas.microsoft.com/office/drawing/2016/5/13/chartex" xmlns:cx8="http://schemas.microsoft.com/office/drawing/2016/5/14/chartex" xmlns:cr="http://schemas.microsoft.com/office/comments/2020/reactions" xmlns:mc="http://schemas.openxmlformats.org/markup-compatibility/2006" xmlns:aink="http://schemas.microsoft.com/office/drawing/2016/ink" xmlns:am3d="http://schemas.microsoft.com/office/drawing/2017/model3d" xmlns:o="urn:schemas-microsoft-com:office:office" xmlns:oel="http://schemas.microsoft.com/office/2019/extlst" xmlns:r="http://schemas.openxmlformats.org/officeDocument/2006/relationships" xmlns:m="http://schemas.openxmlformats.org/officeDocument/2006/math" xmlns:v="urn:schemas-microsoft-com:vml" xmlns:wp14="http://schemas.microsoft.com/office/word/2010/wordprocessingDrawing" xmlns:wp="http://schemas.openxmlformats.org/drawingml/2006/wordprocessingDrawing" xmlns:w10="urn:schemas-microsoft-com:office:word" xmlns:w="http://schemas.openxmlformats.org/wordprocessingml/2006/main" xmlns:w14="http://schemas.microsoft.com/office/word/2010/wordml" xmlns:w15="http://schemas.microsoft.com/office/word/2012/wordml" xmlns:w16cex="http://schemas.microsoft.com/office/word/2018/wordml/cex" xmlns:w16cid="http://schemas.microsoft.com/office/word/2016/wordml/cid" xmlns:w16="http://schemas.microsoft.com/office/word/2018/wordml" xmlns:w16du="http://schemas.microsoft.com/office/word/2023/wordml/word16du" xmlns:w16sdtdh="http://schemas.microsoft.com/office/word/2020/wordml/sdtdatahash" xmlns:w16sdtfl="http://schemas.microsoft.com/office/word/2024/wordml/sdtformatlock" xmlns:w16se="http://schemas.microsoft.com/office/word/2015/wordml/symex" xmlns:wpg="http://schemas.microsoft.com/office/word/2010/wordprocessingGroup" xmlns:wpi="http://schemas.microsoft.com/office/word/2010/wordprocessingInk" xmlns:wne="http://schemas.microsoft.com/office/word/2006/wordml" xmlns:wps="http://schemas.microsoft.com/office/word/2010/wordprocessingShape" mc:Ignorable="w14 w15 w16se w16cid w16 w16cex w16sdtdh w16sdtfl cr w16du wp14">
+  <w16cex:commentExtensible w16cex:durableId="7967E8CD" w16cex:dateUtc="2026-03-28T17:02:00Z"/>
+</w16cex:commentsExtensible>
+</file>
+
+<file path=word/commentsIds.xml><?xml version="1.0" encoding="utf-8"?>
+<w16cid:commentsIds xmlns:wpc="http://schemas.microsoft.com/office/word/2010/wordprocessingCanvas" xmlns:cx="http://schemas.microsoft.com/office/drawing/2014/chartex" xmlns:cx1="http://schemas.microsoft.com/office/drawing/2015/9/8/chartex" xmlns:cx2="http://schemas.microsoft.com/office/drawing/2015/10/21/chartex" xmlns:cx3="http://schemas.microsoft.com/office/drawing/2016/5/9/chartex" xmlns:cx4="http://schemas.microsoft.com/office/drawing/2016/5/10/chartex" xmlns:cx5="http://schemas.microsoft.com/office/drawing/2016/5/11/chartex" xmlns:cx6="http://schemas.microsoft.com/office/drawing/2016/5/12/chartex" xmlns:cx7="http://schemas.microsoft.com/office/drawing/2016/5/13/chartex" xmlns:cx8="http://schemas.microsoft.com/office/drawing/2016/5/14/chartex" xmlns:mc="http://schemas.openxmlformats.org/markup-compatibility/2006" xmlns:aink="http://schemas.microsoft.com/office/drawing/2016/ink" xmlns:am3d="http://schemas.microsoft.com/office/drawing/2017/model3d" xmlns:o="urn:schemas-microsoft-com:office:office" xmlns:oel="http://schemas.microsoft.com/office/2019/extlst" xmlns:r="http://schemas.openxmlformats.org/officeDocument/2006/relationships" xmlns:m="http://schemas.openxmlformats.org/officeDocument/2006/math" xmlns:v="urn:schemas-microsoft-com:vml" xmlns:wp14="http://schemas.microsoft.com/office/word/2010/wordprocessingDrawing" xmlns:wp="http://schemas.openxmlformats.org/drawingml/2006/wordprocessingDrawing" xmlns:w10="urn:schemas-microsoft-com:office:word" xmlns:w="http://schemas.openxmlformats.org/wordprocessingml/2006/main" xmlns:w14="http://schemas.microsoft.com/office/word/2010/wordml" xmlns:w15="http://schemas.microsoft.com/office/word/2012/wordml" xmlns:w16cex="http://schemas.microsoft.com/office/word/2018/wordml/cex" xmlns:w16cid="http://schemas.microsoft.com/office/word/2016/wordml/cid" xmlns:w16="http://schemas.microsoft.com/office/word/2018/wordml" xmlns:w16du="http://schemas.microsoft.com/office/word/2023/wordml/word16du" xmlns:w16sdtdh="http://schemas.microsoft.com/office/word/2020/wordml/sdtdatahash" xmlns:w16sdtfl="http://schemas.microsoft.com/office/word/2024/wordml/sdtformatlock" xmlns:w16se="http://schemas.microsoft.com/office/word/2015/wordml/symex" xmlns:wpg="http://schemas.microsoft.com/office/word/2010/wordprocessingGroup" xmlns:wpi="http://schemas.microsoft.com/office/word/2010/wordprocessingInk" xmlns:wne="http://schemas.microsoft.com/office/word/2006/wordml" xmlns:wps="http://schemas.microsoft.com/office/word/2010/wordprocessingShape" mc:Ignorable="w14 w15 w16se w16cid w16 w16cex w16sdtdh w16sdtfl w16du wp14">
+  <w16cid:commentId w16cid:paraId="44E31EEA" w16cid:durableId="7967E8CD"/>
+</w16cid:commentsIds>
 </file>
 
 <file path=word/endnotes.xml><?xml version="1.0" encoding="utf-8"?>
@@ -2394,6 +2469,14 @@
 </w:numbering>
 </file>
 
+<file path=word/people.xml><?xml version="1.0" encoding="utf-8"?>
+<w15:people xmlns:wpc="http://schemas.microsoft.com/office/word/2010/wordprocessingCanvas" xmlns:cx="http://schemas.microsoft.com/office/drawing/2014/chartex" xmlns:cx1="http://schemas.microsoft.com/office/drawing/2015/9/8/chartex" xmlns:cx2="http://schemas.microsoft.com/office/drawing/2015/10/21/chartex" xmlns:cx3="http://schemas.microsoft.com/office/drawing/2016/5/9/chartex" xmlns:cx4="http://schemas.microsoft.com/office/drawing/2016/5/10/chartex" xmlns:cx5="http://schemas.microsoft.com/office/drawing/2016/5/11/chartex" xmlns:cx6="http://schemas.microsoft.com/office/drawing/2016/5/12/chartex" xmlns:cx7="http://schemas.microsoft.com/office/drawing/2016/5/13/chartex" xmlns:cx8="http://schemas.microsoft.com/office/drawing/2016/5/14/chartex" xmlns:mc="http://schemas.openxmlformats.org/markup-compatibility/2006" xmlns:aink="http://schemas.microsoft.com/office/drawing/2016/ink" xmlns:am3d="http://schemas.microsoft.com/office/drawing/2017/model3d" xmlns:o="urn:schemas-microsoft-com:office:office" xmlns:oel="http://schemas.microsoft.com/office/2019/extlst" xmlns:r="http://schemas.openxmlformats.org/officeDocument/2006/relationships" xmlns:m="http://schemas.openxmlformats.org/officeDocument/2006/math" xmlns:v="urn:schemas-microsoft-com:vml" xmlns:wp14="http://schemas.microsoft.com/office/word/2010/wordprocessingDrawing" xmlns:wp="http://schemas.openxmlformats.org/drawingml/2006/wordprocessingDrawing" xmlns:w10="urn:schemas-microsoft-com:office:word" xmlns:w="http://schemas.openxmlformats.org/wordprocessingml/2006/main" xmlns:w14="http://schemas.microsoft.com/office/word/2010/wordml" xmlns:w15="http://schemas.microsoft.com/office/word/2012/wordml" xmlns:w16cex="http://schemas.microsoft.com/office/word/2018/wordml/cex" xmlns:w16cid="http://schemas.microsoft.com/office/word/2016/wordml/cid" xmlns:w16="http://schemas.microsoft.com/office/word/2018/wordml" xmlns:w16du="http://schemas.microsoft.com/office/word/2023/wordml/word16du" xmlns:w16sdtdh="http://schemas.microsoft.com/office/word/2020/wordml/sdtdatahash" xmlns:w16sdtfl="http://schemas.microsoft.com/office/word/2024/wordml/sdtformatlock" xmlns:w16se="http://schemas.microsoft.com/office/word/2015/wordml/symex" xmlns:wpg="http://schemas.microsoft.com/office/word/2010/wordprocessingGroup" xmlns:wpi="http://schemas.microsoft.com/office/word/2010/wordprocessingInk" xmlns:wne="http://schemas.microsoft.com/office/word/2006/wordml" xmlns:wps="http://schemas.microsoft.com/office/word/2010/wordprocessingShape" mc:Ignorable="w14 w15 w16se w16cid w16 w16cex w16sdtdh w16sdtfl w16du wp14">
+  <w15:person w15:author="Jerry">
+    <w15:presenceInfo w15:providerId="None" w15:userId="Jerry"/>
+  </w15:person>
+</w15:people>
+</file>
+
 <file path=word/styles.xml><?xml version="1.0" encoding="utf-8"?>
 <w:styles xmlns:mc="http://schemas.openxmlformats.org/markup-compatibility/2006" xmlns:r="http://schemas.openxmlformats.org/officeDocument/2006/relationships" xmlns:w="http://schemas.openxmlformats.org/wordprocessingml/2006/main" xmlns:w14="http://schemas.microsoft.com/office/word/2010/wordml" xmlns:w15="http://schemas.microsoft.com/office/word/2012/wordml" xmlns:w16cex="http://schemas.microsoft.com/office/word/2018/wordml/cex" xmlns:w16cid="http://schemas.microsoft.com/office/word/2016/wordml/cid" xmlns:w16="http://schemas.microsoft.com/office/word/2018/wordml" xmlns:w16du="http://schemas.microsoft.com/office/word/2023/wordml/word16du" xmlns:w16sdtdh="http://schemas.microsoft.com/office/word/2020/wordml/sdtdatahash" xmlns:w16sdtfl="http://schemas.microsoft.com/office/word/2024/wordml/sdtformatlock" xmlns:w16se="http://schemas.microsoft.com/office/word/2015/wordml/symex" mc:Ignorable="w14 w15 w16se w16cid w16 w16cex w16sdtdh w16sdtfl w16du">
   <w:docDefaults>
@@ -2436,7 +2519,7 @@
     <w:lsdException w:name="toc 9" w:semiHidden="1" w:unhideWhenUsed="1"/>
     <w:lsdException w:name="Normal Indent" w:semiHidden="1" w:unhideWhenUsed="1"/>
     <w:lsdException w:name="footnote text" w:semiHidden="1" w:unhideWhenUsed="1"/>
-    <w:lsdException w:name="annotation text" w:semiHidden="1" w:unhideWhenUsed="1"/>
+    <w:lsdException w:name="annotation text" w:semiHidden="1" w:uiPriority="99" w:unhideWhenUsed="1"/>
     <w:lsdException w:name="header" w:semiHidden="1" w:unhideWhenUsed="1"/>
     <w:lsdException w:name="footer" w:semiHidden="1" w:unhideWhenUsed="1"/>
     <w:lsdException w:name="index heading" w:semiHidden="1" w:unhideWhenUsed="1"/>
@@ -2445,7 +2528,7 @@
     <w:lsdException w:name="envelope address" w:semiHidden="1" w:unhideWhenUsed="1"/>
     <w:lsdException w:name="envelope return" w:semiHidden="1" w:unhideWhenUsed="1"/>
     <w:lsdException w:name="footnote reference" w:semiHidden="1" w:unhideWhenUsed="1"/>
-    <w:lsdException w:name="annotation reference" w:semiHidden="1" w:unhideWhenUsed="1"/>
+    <w:lsdException w:name="annotation reference" w:semiHidden="1" w:uiPriority="99" w:unhideWhenUsed="1"/>
     <w:lsdException w:name="line number" w:semiHidden="1" w:unhideWhenUsed="1"/>
     <w:lsdException w:name="page number" w:semiHidden="1" w:unhideWhenUsed="1"/>
     <w:lsdException w:name="endnote reference" w:semiHidden="1" w:unhideWhenUsed="1"/>
@@ -3013,6 +3096,50 @@
       <w:iCs/>
     </w:rPr>
   </w:style>
+  <w:style w:type="character" w:styleId="CommentReference">
+    <w:name w:val="annotation reference"/>
+    <w:basedOn w:val="DefaultParagraphFont"/>
+    <w:uiPriority w:val="99"/>
+    <w:semiHidden/>
+    <w:unhideWhenUsed/>
+    <w:rsid w:val="00847D01"/>
+    <w:rPr>
+      <w:sz w:val="16"/>
+      <w:szCs w:val="16"/>
+    </w:rPr>
+  </w:style>
+  <w:style w:type="paragraph" w:styleId="CommentText">
+    <w:name w:val="annotation text"/>
+    <w:basedOn w:val="Normal"/>
+    <w:link w:val="CommentTextChar"/>
+    <w:uiPriority w:val="99"/>
+    <w:unhideWhenUsed/>
+    <w:rsid w:val="00847D01"/>
+    <w:pPr>
+      <w:spacing w:after="160" w:line="240" w:lineRule="auto"/>
+    </w:pPr>
+    <w:rPr>
+      <w:rFonts w:asciiTheme="minorHAnsi" w:eastAsiaTheme="minorEastAsia" w:hAnsiTheme="minorHAnsi" w:cstheme="minorBidi"/>
+      <w:kern w:val="2"/>
+      <w:sz w:val="20"/>
+      <w:szCs w:val="20"/>
+      <w:lang w:eastAsia="ko-KR"/>
+      <w14:ligatures w14:val="standardContextual"/>
+    </w:rPr>
+  </w:style>
+  <w:style w:type="character" w:customStyle="1" w:styleId="CommentTextChar">
+    <w:name w:val="Comment Text Char"/>
+    <w:basedOn w:val="DefaultParagraphFont"/>
+    <w:link w:val="CommentText"/>
+    <w:uiPriority w:val="99"/>
+    <w:rsid w:val="00847D01"/>
+    <w:rPr>
+      <w:rFonts w:asciiTheme="minorHAnsi" w:eastAsiaTheme="minorEastAsia" w:hAnsiTheme="minorHAnsi" w:cstheme="minorBidi"/>
+      <w:kern w:val="2"/>
+      <w:lang w:eastAsia="ko-KR"/>
+      <w14:ligatures w14:val="standardContextual"/>
+    </w:rPr>
+  </w:style>
 </w:styles>
 </file>
 
@@ -3302,12 +3429,6 @@
 </file>
 
 <file path=customXml/item1.xml><?xml version="1.0" encoding="utf-8"?>
-<p:properties xmlns:p="http://schemas.microsoft.com/office/2006/metadata/properties" xmlns:xsi="http://www.w3.org/2001/XMLSchema-instance" xmlns:pc="http://schemas.microsoft.com/office/infopath/2007/PartnerControls">
-  <documentManagement/>
-</p:properties>
-</file>
-
-<file path=customXml/item2.xml><?xml version="1.0" encoding="utf-8"?>
 <?mso-contentType ?>
 <FormTemplates xmlns="http://schemas.microsoft.com/sharepoint/v3/contenttype/forms">
   <Display>DocumentLibraryForm</Display>
@@ -3316,7 +3437,17 @@
 </FormTemplates>
 </file>
 
+<file path=customXml/item2.xml><?xml version="1.0" encoding="utf-8"?>
+<p:properties xmlns:p="http://schemas.microsoft.com/office/2006/metadata/properties" xmlns:xsi="http://www.w3.org/2001/XMLSchema-instance" xmlns:pc="http://schemas.microsoft.com/office/infopath/2007/PartnerControls">
+  <documentManagement/>
+</p:properties>
+</file>
+
 <file path=customXml/item3.xml><?xml version="1.0" encoding="utf-8"?>
+<b:Sources xmlns:b="http://schemas.openxmlformats.org/officeDocument/2006/bibliography" xmlns="http://schemas.openxmlformats.org/officeDocument/2006/bibliography" SelectedStyle="\APA.XSL" StyleName="APA"/>
+</file>
+
+<file path=customXml/item4.xml><?xml version="1.0" encoding="utf-8"?>
 <ct:contentTypeSchema xmlns:ct="http://schemas.microsoft.com/office/2006/metadata/contentType" xmlns:ma="http://schemas.microsoft.com/office/2006/metadata/properties/metaAttributes" ct:_="" ma:_="" ma:contentTypeName="Document" ma:contentTypeID="0x01010033553FA8616F3A45AD369E275EA42271" ma:contentTypeVersion="11" ma:contentTypeDescription="Create a new document." ma:contentTypeScope="" ma:versionID="8eb4e0804d077bcc139b361cda3a640c">
   <xsd:schema xmlns:xsd="http://www.w3.org/2001/XMLSchema" xmlns:xs="http://www.w3.org/2001/XMLSchema" xmlns:p="http://schemas.microsoft.com/office/2006/metadata/properties" xmlns:ns3="371a10d4-9e19-41a9-948b-d1cca29b4cb6" xmlns:ns4="18dffc30-a361-43f0-bb4a-1f62e819a6f2" targetNamespace="http://schemas.microsoft.com/office/2006/metadata/properties" ma:root="true" ma:fieldsID="ac8e08ff64368403dfb4d2274f8d7465" ns3:_="" ns4:_="">
     <xsd:import namespace="371a10d4-9e19-41a9-948b-d1cca29b4cb6"/>
@@ -3525,11 +3656,15 @@
 </ct:contentTypeSchema>
 </file>
 
-<file path=customXml/item4.xml><?xml version="1.0" encoding="utf-8"?>
-<b:Sources xmlns:b="http://schemas.openxmlformats.org/officeDocument/2006/bibliography" xmlns="http://schemas.openxmlformats.org/officeDocument/2006/bibliography" SelectedStyle="\APA.XSL" StyleName="APA"/>
+<file path=customXml/itemProps1.xml><?xml version="1.0" encoding="utf-8"?>
+<ds:datastoreItem xmlns:ds="http://schemas.openxmlformats.org/officeDocument/2006/customXml" ds:itemID="{05D9BF79-26A9-4E9A-9793-4E28B04A02DC}">
+  <ds:schemaRefs>
+    <ds:schemaRef ds:uri="http://schemas.microsoft.com/sharepoint/v3/contenttype/forms"/>
+  </ds:schemaRefs>
+</ds:datastoreItem>
 </file>
 
-<file path=customXml/itemProps1.xml><?xml version="1.0" encoding="utf-8"?>
+<file path=customXml/itemProps2.xml><?xml version="1.0" encoding="utf-8"?>
 <ds:datastoreItem xmlns:ds="http://schemas.openxmlformats.org/officeDocument/2006/customXml" ds:itemID="{10A8F88B-6E38-47A8-8074-155E10D59BDF}">
   <ds:schemaRefs>
     <ds:schemaRef ds:uri="http://schemas.microsoft.com/office/2006/metadata/properties"/>
@@ -3538,15 +3673,15 @@
 </ds:datastoreItem>
 </file>
 
-<file path=customXml/itemProps2.xml><?xml version="1.0" encoding="utf-8"?>
-<ds:datastoreItem xmlns:ds="http://schemas.openxmlformats.org/officeDocument/2006/customXml" ds:itemID="{05D9BF79-26A9-4E9A-9793-4E28B04A02DC}">
+<file path=customXml/itemProps3.xml><?xml version="1.0" encoding="utf-8"?>
+<ds:datastoreItem xmlns:ds="http://schemas.openxmlformats.org/officeDocument/2006/customXml" ds:itemID="{79CEDF70-F74C-4284-98FC-38644A27E791}">
   <ds:schemaRefs>
-    <ds:schemaRef ds:uri="http://schemas.microsoft.com/sharepoint/v3/contenttype/forms"/>
+    <ds:schemaRef ds:uri="http://schemas.openxmlformats.org/officeDocument/2006/bibliography"/>
   </ds:schemaRefs>
 </ds:datastoreItem>
 </file>
 
-<file path=customXml/itemProps3.xml><?xml version="1.0" encoding="utf-8"?>
+<file path=customXml/itemProps4.xml><?xml version="1.0" encoding="utf-8"?>
 <ds:datastoreItem xmlns:ds="http://schemas.openxmlformats.org/officeDocument/2006/customXml" ds:itemID="{307A6BE8-0D48-4A7D-A535-369CCDFBF2CB}">
   <ds:schemaRefs>
     <ds:schemaRef ds:uri="http://schemas.microsoft.com/office/2006/metadata/contentType"/>
@@ -3563,12 +3698,4 @@
     <ds:schemaRef ds:uri="http://schemas.microsoft.com/internal/obd"/>
   </ds:schemaRefs>
 </ds:datastoreItem>
-</file>
-
-<file path=customXml/itemProps4.xml><?xml version="1.0" encoding="utf-8"?>
-<ds:datastoreItem xmlns:ds="http://schemas.openxmlformats.org/officeDocument/2006/customXml" ds:itemID="{79CEDF70-F74C-4284-98FC-38644A27E791}">
-  <ds:schemaRefs>
-    <ds:schemaRef ds:uri="http://schemas.openxmlformats.org/officeDocument/2006/bibliography"/>
-  </ds:schemaRefs>
-</ds:datastoreItem>
 </file>
</xml_diff>

<commit_message>
added: all exports to levelModifier script
</commit_message>
<xml_diff>
--- a/Documents/Dissertation.docx
+++ b/Documents/Dissertation.docx
@@ -1388,7 +1388,15 @@
         <w:t xml:space="preserve">and </w:t>
       </w:r>
       <w:r>
-        <w:t>information outputted after the level will be employed to evaluate the effectiveness of this project. Participants  will test a generated level and will fill out a questionnaire regarding feedback on what they experienced.</w:t>
+        <w:t xml:space="preserve">information outputted after the level will be employed to evaluate the effectiveness of this project. </w:t>
+      </w:r>
+      <w:proofErr w:type="gramStart"/>
+      <w:r>
+        <w:t>Participants  will</w:t>
+      </w:r>
+      <w:proofErr w:type="gramEnd"/>
+      <w:r>
+        <w:t xml:space="preserve"> test a generated level and will fill out a questionnaire regarding feedback on what they experienced.</w:t>
       </w:r>
     </w:p>
     <w:p/>
@@ -1638,7 +1646,23 @@
     <w:p/>
     <w:p>
       <w:r>
-        <w:t>The article goes on to mention about creating a pattern based on difficulty. This is a great start, however this does not make the level feel unique since you are just limiting it to difficulty. Instead, the application has a way to change the likelihood of what will spawn in the level in order to allow an adjustment for difficulty, but also to allow for one level with the same difficulty to be completely unique from another level with the same difficulty.</w:t>
+        <w:t xml:space="preserve">The article goes on to mention about creating a pattern based on difficulty. This is a great </w:t>
+      </w:r>
+      <w:proofErr w:type="gramStart"/>
+      <w:r>
+        <w:t>start,</w:t>
+      </w:r>
+      <w:proofErr w:type="gramEnd"/>
+      <w:r>
+        <w:t xml:space="preserve"> however this does not make the level feel unique since you are just limiting it to difficulty. Instead, the application has a way to change the likelihood of what will spawn in the level </w:t>
+      </w:r>
+      <w:proofErr w:type="gramStart"/>
+      <w:r>
+        <w:t>in order to</w:t>
+      </w:r>
+      <w:proofErr w:type="gramEnd"/>
+      <w:r>
+        <w:t xml:space="preserve"> allow an adjustment for difficulty, but also to allow for one level with the same difficulty to be completely unique from another level with the same difficulty.</w:t>
       </w:r>
     </w:p>
     <w:p/>
@@ -1661,7 +1685,15 @@
         <w:t xml:space="preserve"> (ref here), the generation is unfortunately flawed since it uses 9 different algorithms, which unfortunately makes the scope too big for the timeframe of this project. The article does have restrictions of furnishing however, which the project has made use of by </w:t>
       </w:r>
       <w:r>
-        <w:t xml:space="preserve">restricting the amount of spikes and bounce pads, health packs, and coins a level can have. </w:t>
+        <w:t xml:space="preserve">restricting the </w:t>
+      </w:r>
+      <w:proofErr w:type="gramStart"/>
+      <w:r>
+        <w:t>amount</w:t>
+      </w:r>
+      <w:proofErr w:type="gramEnd"/>
+      <w:r>
+        <w:t xml:space="preserve"> of spikes and bounce pads, health packs, and coins a level can have. </w:t>
       </w:r>
       <w:r>
         <w:t>The level also has a limit of one checkpoint per section, and only one goal per level.</w:t>
@@ -1670,7 +1702,15 @@
     <w:p/>
     <w:p>
       <w:r>
-        <w:t xml:space="preserve">The idea of the two-step generation is also in the application, where the platforms will be generated. After each platform generation, the collectable positions of that platform will be determined if there is any collectables. </w:t>
+        <w:t xml:space="preserve">The idea of the two-step generation is also in the application, where the platforms will be generated. After each platform generation, the collectable positions of that platform will be determined if there </w:t>
+      </w:r>
+      <w:proofErr w:type="gramStart"/>
+      <w:r>
+        <w:t>is</w:t>
+      </w:r>
+      <w:proofErr w:type="gramEnd"/>
+      <w:r>
+        <w:t xml:space="preserve"> any collectables. </w:t>
       </w:r>
       <w:r>
         <w:t xml:space="preserve"> </w:t>
@@ -1714,18 +1754,22 @@
     </w:p>
     <w:p/>
     <w:p>
-      <w:commentRangeStart w:id="7"/>
-      <w:r>
-        <w:t xml:space="preserve">It states an advantage of procedural generation, which is that it can reduce the disk capacity of the final game dramatically since the content that is generated throughout the game is created on the fly. For example, in the application, when the player reaches a checkpoint, the content generated is determined just when the player touches the checkpoint, rather than generating it all at the start or before run time. This is effective for reducing compile times at the start since there isn’t as many assets to load at the beginning, and there isn’t any need to store the level itself in the game’s files, thus saving storage space. </w:t>
-      </w:r>
-      <w:commentRangeEnd w:id="7"/>
-      <w:r>
-        <w:rPr>
-          <w:rStyle w:val="CommentReference"/>
-          <w:sz w:val="24"/>
-          <w:szCs w:val="24"/>
-        </w:rPr>
-        <w:commentReference w:id="7"/>
+      <w:r>
+        <w:t xml:space="preserve">It states an advantage of procedural generation, which is that it can reduce the disk capacity of the final game dramatically since the content that is generated throughout the game is created on the fly. For example, in the application, when the player reaches a checkpoint, the content generated is determined just when the player touches the checkpoint, rather than generating it all at the start or before run time. This is effective for reducing compile times at the start since there isn’t as many </w:t>
+      </w:r>
+      <w:proofErr w:type="gramStart"/>
+      <w:r>
+        <w:t>assets</w:t>
+      </w:r>
+      <w:proofErr w:type="gramEnd"/>
+      <w:r>
+        <w:t xml:space="preserve"> to load at the beginning, and there is</w:t>
+      </w:r>
+      <w:r>
+        <w:t xml:space="preserve"> not</w:t>
+      </w:r>
+      <w:r>
+        <w:t xml:space="preserve"> any need to store the level itself in the game’s files, thus saving storage space. </w:t>
       </w:r>
     </w:p>
     <w:p/>
@@ -1753,7 +1797,15 @@
     </w:p>
     <w:p>
       <w:r>
-        <w:t>The paper does state that some machine learning methods, such as generative adversial networks is not a suitable method since it takes up too much computational power, which is not suited for real time content generation. I believe this effective since the paper is not afraid to mention flaws about procedural generation methods, which allows researchers to ensure they are making the right decisions when utilising procedural generation in their application.</w:t>
+        <w:t xml:space="preserve">The paper does state that some machine learning methods, such as generative </w:t>
+      </w:r>
+      <w:proofErr w:type="spellStart"/>
+      <w:r>
+        <w:t>adversial</w:t>
+      </w:r>
+      <w:proofErr w:type="spellEnd"/>
+      <w:r>
+        <w:t xml:space="preserve"> networks is not a suitable method since it takes up too much computational power, which is not suited for real time content generation. I believe this effective since the paper is not afraid to mention flaws about procedural generation methods, which allows researchers to ensure they are making the right decisions when utilising procedural generation in their application.</w:t>
       </w:r>
     </w:p>
     <w:p/>
@@ -1769,12 +1821,28 @@
       </w:r>
       <w:r>
         <w:lastRenderedPageBreak/>
-        <w:t xml:space="preserve">isn’t much in terms of replayability for the level layouts changing for example. </w:t>
-      </w:r>
-    </w:p>
-    <w:p>
-      <w:r>
-        <w:t>The article ensures to mention that rules are required to prevent softlocks, such as with the improved spawn algorithm where special attention is given to the fact that all entrances cannot face any wall side, as a minimum distance from it is estimated. This is effective since the application also has some rules to prevent soft locks to name specific jump gaps and predefined platform sizes.</w:t>
+        <w:t xml:space="preserve">isn’t much in terms of </w:t>
+      </w:r>
+      <w:proofErr w:type="spellStart"/>
+      <w:r>
+        <w:t>replayability</w:t>
+      </w:r>
+      <w:proofErr w:type="spellEnd"/>
+      <w:r>
+        <w:t xml:space="preserve"> for the level layouts changing for example. </w:t>
+      </w:r>
+    </w:p>
+    <w:p>
+      <w:r>
+        <w:t xml:space="preserve">The article ensures to mention that rules are required to prevent </w:t>
+      </w:r>
+      <w:proofErr w:type="spellStart"/>
+      <w:r>
+        <w:t>softlocks</w:t>
+      </w:r>
+      <w:proofErr w:type="spellEnd"/>
+      <w:r>
+        <w:t>, such as with the improved spawn algorithm where special attention is given to the fact that all entrances cannot face any wall side, as a minimum distance from it is estimated. This is effective since the application also has some rules to prevent soft locks to name specific jump gaps and predefined platform sizes.</w:t>
       </w:r>
     </w:p>
     <w:p/>
@@ -1792,10 +1860,13 @@
     </w:p>
     <w:p>
       <w:r>
-        <w:t>In Level Design Patterns in 2D Games</w:t>
-      </w:r>
-      <w:r>
-        <w:t>(ref here)</w:t>
+        <w:t xml:space="preserve">In Level Design Patterns in 2D </w:t>
+      </w:r>
+      <w:r>
+        <w:t>Games (</w:t>
+      </w:r>
+      <w:r>
+        <w:t>ref here)</w:t>
       </w:r>
       <w:r>
         <w:t xml:space="preserve">, it discusses in the introduction that level design </w:t>
@@ -1810,13 +1881,29 @@
         <w:t xml:space="preserve">The article has been effective for level design patterns, especially with the guidance segment, </w:t>
       </w:r>
       <w:r>
-        <w:t xml:space="preserve">which can help the player to figure where they might go next. This is important in level design since the player might feel lost of where to go without this mechanic, such as not having a trail of coins go towards where the player needs to go </w:t>
+        <w:t xml:space="preserve">which can help the player to figure where they might go next. This is important in level design since the player might feel </w:t>
+      </w:r>
+      <w:proofErr w:type="spellStart"/>
+      <w:r>
+        <w:t>lost</w:t>
+      </w:r>
+      <w:proofErr w:type="spellEnd"/>
+      <w:r>
+        <w:t xml:space="preserve"> of where to go without this mechanic, such as not having a trail of coins go towards where the player needs to go </w:t>
       </w:r>
       <w:r>
         <w:t>next or</w:t>
       </w:r>
       <w:r>
-        <w:t xml:space="preserve"> having an arrow at the checkpoint for where the player needs to go. Pace breaking is also a powerful method for level design since it can dramatically change the parts of a level. For instance, having a lot of smaller jumps/smaller platforms in one part of the level, and then having lots of paths/coins in another segment. Checkpoints and save zones are another form of this, where for example in the application, a checkpoint will be located in a platform that is safe for the player so once they reach the checkpoint, </w:t>
+        <w:t xml:space="preserve"> having an arrow at the checkpoint for where the player needs to go. Pace breaking is also a powerful method for level design since it can dramatically change the parts of a level. For instance, having a lot of smaller jumps/smaller platforms in one part of the level, and then having lots of paths/coins in another segment. Checkpoints and save zones are another form of this, where for example in the application, a checkpoint will </w:t>
+      </w:r>
+      <w:proofErr w:type="gramStart"/>
+      <w:r>
+        <w:t>be located in</w:t>
+      </w:r>
+      <w:proofErr w:type="gramEnd"/>
+      <w:r>
+        <w:t xml:space="preserve"> a platform that is safe for the player so once they reach the checkpoint, </w:t>
       </w:r>
       <w:r>
         <w:lastRenderedPageBreak/>
@@ -1857,7 +1944,7 @@
         <w:pStyle w:val="Heading1"/>
         <w:jc w:val="center"/>
       </w:pPr>
-      <w:bookmarkStart w:id="8" w:name="_Toc92987354"/>
+      <w:bookmarkStart w:id="7" w:name="_Toc92987354"/>
       <w:r>
         <w:lastRenderedPageBreak/>
         <w:t>Chapter 3</w:t>
@@ -1865,7 +1952,7 @@
       <w:r>
         <w:t xml:space="preserve"> Methodology</w:t>
       </w:r>
-      <w:bookmarkEnd w:id="8"/>
+      <w:bookmarkEnd w:id="7"/>
       <w:r>
         <w:br w:type="page"/>
       </w:r>
@@ -1875,7 +1962,7 @@
         <w:pStyle w:val="Heading1"/>
         <w:jc w:val="center"/>
       </w:pPr>
-      <w:bookmarkStart w:id="9" w:name="_Toc92987355"/>
+      <w:bookmarkStart w:id="8" w:name="_Toc92987355"/>
       <w:r>
         <w:lastRenderedPageBreak/>
         <w:t>Chapter 4</w:t>
@@ -1883,7 +1970,7 @@
       <w:r>
         <w:t xml:space="preserve"> Results</w:t>
       </w:r>
-      <w:bookmarkEnd w:id="9"/>
+      <w:bookmarkEnd w:id="8"/>
       <w:r>
         <w:br w:type="page"/>
       </w:r>
@@ -1893,7 +1980,7 @@
         <w:pStyle w:val="Heading1"/>
         <w:jc w:val="center"/>
       </w:pPr>
-      <w:bookmarkStart w:id="10" w:name="_Toc92987356"/>
+      <w:bookmarkStart w:id="9" w:name="_Toc92987356"/>
       <w:r>
         <w:lastRenderedPageBreak/>
         <w:t>Chapter 5</w:t>
@@ -1901,7 +1988,7 @@
       <w:r>
         <w:t xml:space="preserve"> Discussion</w:t>
       </w:r>
-      <w:bookmarkEnd w:id="10"/>
+      <w:bookmarkEnd w:id="9"/>
       <w:r>
         <w:br w:type="page"/>
       </w:r>
@@ -1911,7 +1998,7 @@
         <w:pStyle w:val="Heading1"/>
         <w:jc w:val="center"/>
       </w:pPr>
-      <w:bookmarkStart w:id="11" w:name="_Toc92987357"/>
+      <w:bookmarkStart w:id="10" w:name="_Toc92987357"/>
       <w:r>
         <w:lastRenderedPageBreak/>
         <w:t>Chapter 6</w:t>
@@ -1925,7 +2012,7 @@
       <w:r>
         <w:t>uture Work</w:t>
       </w:r>
-      <w:bookmarkEnd w:id="11"/>
+      <w:bookmarkEnd w:id="10"/>
       <w:r>
         <w:br w:type="page"/>
       </w:r>
@@ -1934,12 +2021,12 @@
       <w:pPr>
         <w:pStyle w:val="Heading1"/>
       </w:pPr>
-      <w:bookmarkStart w:id="12" w:name="_Toc92987358"/>
+      <w:bookmarkStart w:id="11" w:name="_Toc92987358"/>
       <w:r>
         <w:lastRenderedPageBreak/>
         <w:t>List of References</w:t>
       </w:r>
-      <w:bookmarkEnd w:id="12"/>
+      <w:bookmarkEnd w:id="11"/>
     </w:p>
     <w:p>
       <w:pPr>
@@ -1948,20 +2035,20 @@
       <w:r>
         <w:br w:type="page"/>
       </w:r>
-      <w:bookmarkStart w:id="13" w:name="_Toc92987359"/>
-      <w:bookmarkStart w:id="14" w:name="_Toc447628191"/>
+      <w:bookmarkStart w:id="12" w:name="_Toc92987359"/>
+      <w:bookmarkStart w:id="13" w:name="_Toc447628191"/>
       <w:r>
         <w:lastRenderedPageBreak/>
         <w:t>Bibliography</w:t>
       </w:r>
-      <w:bookmarkEnd w:id="13"/>
+      <w:bookmarkEnd w:id="12"/>
     </w:p>
     <w:p>
       <w:r>
         <w:t>If required</w:t>
       </w:r>
     </w:p>
-    <w:bookmarkEnd w:id="14"/>
+    <w:bookmarkEnd w:id="13"/>
     <w:p/>
     <w:p>
       <w:pPr>
@@ -1976,20 +2063,20 @@
       <w:pPr>
         <w:pStyle w:val="Heading1"/>
       </w:pPr>
-      <w:bookmarkStart w:id="15" w:name="_Toc92987360"/>
+      <w:bookmarkStart w:id="14" w:name="_Toc92987360"/>
       <w:r>
         <w:lastRenderedPageBreak/>
         <w:t>Appendices</w:t>
       </w:r>
-      <w:bookmarkEnd w:id="15"/>
+      <w:bookmarkEnd w:id="14"/>
       <w:r>
         <w:t xml:space="preserve"> </w:t>
       </w:r>
     </w:p>
     <w:p/>
     <w:sectPr>
-      <w:headerReference w:type="default" r:id="rId18"/>
-      <w:footerReference w:type="default" r:id="rId19"/>
+      <w:headerReference w:type="default" r:id="rId14"/>
+      <w:footerReference w:type="default" r:id="rId15"/>
       <w:pgSz w:w="11906" w:h="16838"/>
       <w:pgMar w:top="1440" w:right="1797" w:bottom="1440" w:left="2268" w:header="720" w:footer="720" w:gutter="0"/>
       <w:pgNumType w:start="1"/>
@@ -1998,48 +2085,6 @@
     </w:sectPr>
   </w:body>
 </w:document>
-</file>
-
-<file path=word/comments.xml><?xml version="1.0" encoding="utf-8"?>
-<w:comments xmlns:wpc="http://schemas.microsoft.com/office/word/2010/wordprocessingCanvas" xmlns:cx="http://schemas.microsoft.com/office/drawing/2014/chartex" xmlns:cx1="http://schemas.microsoft.com/office/drawing/2015/9/8/chartex" xmlns:cx2="http://schemas.microsoft.com/office/drawing/2015/10/21/chartex" xmlns:cx3="http://schemas.microsoft.com/office/drawing/2016/5/9/chartex" xmlns:cx4="http://schemas.microsoft.com/office/drawing/2016/5/10/chartex" xmlns:cx5="http://schemas.microsoft.com/office/drawing/2016/5/11/chartex" xmlns:cx6="http://schemas.microsoft.com/office/drawing/2016/5/12/chartex" xmlns:cx7="http://schemas.microsoft.com/office/drawing/2016/5/13/chartex" xmlns:cx8="http://schemas.microsoft.com/office/drawing/2016/5/14/chartex" xmlns:mc="http://schemas.openxmlformats.org/markup-compatibility/2006" xmlns:aink="http://schemas.microsoft.com/office/drawing/2016/ink" xmlns:am3d="http://schemas.microsoft.com/office/drawing/2017/model3d" xmlns:o="urn:schemas-microsoft-com:office:office" xmlns:oel="http://schemas.microsoft.com/office/2019/extlst" xmlns:r="http://schemas.openxmlformats.org/officeDocument/2006/relationships" xmlns:m="http://schemas.openxmlformats.org/officeDocument/2006/math" xmlns:v="urn:schemas-microsoft-com:vml" xmlns:wp14="http://schemas.microsoft.com/office/word/2010/wordprocessingDrawing" xmlns:wp="http://schemas.openxmlformats.org/drawingml/2006/wordprocessingDrawing" xmlns:w10="urn:schemas-microsoft-com:office:word" xmlns:w="http://schemas.openxmlformats.org/wordprocessingml/2006/main" xmlns:w14="http://schemas.microsoft.com/office/word/2010/wordml" xmlns:w15="http://schemas.microsoft.com/office/word/2012/wordml" xmlns:w16cex="http://schemas.microsoft.com/office/word/2018/wordml/cex" xmlns:w16cid="http://schemas.microsoft.com/office/word/2016/wordml/cid" xmlns:w16="http://schemas.microsoft.com/office/word/2018/wordml" xmlns:w16du="http://schemas.microsoft.com/office/word/2023/wordml/word16du" xmlns:w16sdtdh="http://schemas.microsoft.com/office/word/2020/wordml/sdtdatahash" xmlns:w16sdtfl="http://schemas.microsoft.com/office/word/2024/wordml/sdtformatlock" xmlns:w16se="http://schemas.microsoft.com/office/word/2015/wordml/symex" xmlns:wpg="http://schemas.microsoft.com/office/word/2010/wordprocessingGroup" xmlns:wpi="http://schemas.microsoft.com/office/word/2010/wordprocessingInk" xmlns:wne="http://schemas.microsoft.com/office/word/2006/wordml" xmlns:wps="http://schemas.microsoft.com/office/word/2010/wordprocessingShape" mc:Ignorable="w14 w15 w16se w16cid w16 w16cex w16sdtdh w16sdtfl w16du wp14">
-  <w:comment w:id="7" w:author="Jerry" w:date="2026-03-28T17:02:00Z" w:initials="J">
-    <w:p>
-      <w:pPr>
-        <w:pStyle w:val="CommentText"/>
-      </w:pPr>
-      <w:r>
-        <w:rPr>
-          <w:rStyle w:val="CommentReference"/>
-        </w:rPr>
-        <w:annotationRef/>
-      </w:r>
-      <w:r>
-        <w:rPr>
-          <w:lang w:val="en-US"/>
-        </w:rPr>
-        <w:t>Try to make this less waffle-ly</w:t>
-      </w:r>
-    </w:p>
-  </w:comment>
-</w:comments>
-</file>
-
-<file path=word/commentsExtended.xml><?xml version="1.0" encoding="utf-8"?>
-<w15:commentsEx xmlns:wpc="http://schemas.microsoft.com/office/word/2010/wordprocessingCanvas" xmlns:cx="http://schemas.microsoft.com/office/drawing/2014/chartex" xmlns:cx1="http://schemas.microsoft.com/office/drawing/2015/9/8/chartex" xmlns:cx2="http://schemas.microsoft.com/office/drawing/2015/10/21/chartex" xmlns:cx3="http://schemas.microsoft.com/office/drawing/2016/5/9/chartex" xmlns:cx4="http://schemas.microsoft.com/office/drawing/2016/5/10/chartex" xmlns:cx5="http://schemas.microsoft.com/office/drawing/2016/5/11/chartex" xmlns:cx6="http://schemas.microsoft.com/office/drawing/2016/5/12/chartex" xmlns:cx7="http://schemas.microsoft.com/office/drawing/2016/5/13/chartex" xmlns:cx8="http://schemas.microsoft.com/office/drawing/2016/5/14/chartex" xmlns:mc="http://schemas.openxmlformats.org/markup-compatibility/2006" xmlns:aink="http://schemas.microsoft.com/office/drawing/2016/ink" xmlns:am3d="http://schemas.microsoft.com/office/drawing/2017/model3d" xmlns:o="urn:schemas-microsoft-com:office:office" xmlns:oel="http://schemas.microsoft.com/office/2019/extlst" xmlns:r="http://schemas.openxmlformats.org/officeDocument/2006/relationships" xmlns:m="http://schemas.openxmlformats.org/officeDocument/2006/math" xmlns:v="urn:schemas-microsoft-com:vml" xmlns:wp14="http://schemas.microsoft.com/office/word/2010/wordprocessingDrawing" xmlns:wp="http://schemas.openxmlformats.org/drawingml/2006/wordprocessingDrawing" xmlns:w10="urn:schemas-microsoft-com:office:word" xmlns:w="http://schemas.openxmlformats.org/wordprocessingml/2006/main" xmlns:w14="http://schemas.microsoft.com/office/word/2010/wordml" xmlns:w15="http://schemas.microsoft.com/office/word/2012/wordml" xmlns:w16cex="http://schemas.microsoft.com/office/word/2018/wordml/cex" xmlns:w16cid="http://schemas.microsoft.com/office/word/2016/wordml/cid" xmlns:w16="http://schemas.microsoft.com/office/word/2018/wordml" xmlns:w16du="http://schemas.microsoft.com/office/word/2023/wordml/word16du" xmlns:w16sdtdh="http://schemas.microsoft.com/office/word/2020/wordml/sdtdatahash" xmlns:w16sdtfl="http://schemas.microsoft.com/office/word/2024/wordml/sdtformatlock" xmlns:w16se="http://schemas.microsoft.com/office/word/2015/wordml/symex" xmlns:wpg="http://schemas.microsoft.com/office/word/2010/wordprocessingGroup" xmlns:wpi="http://schemas.microsoft.com/office/word/2010/wordprocessingInk" xmlns:wne="http://schemas.microsoft.com/office/word/2006/wordml" xmlns:wps="http://schemas.microsoft.com/office/word/2010/wordprocessingShape" mc:Ignorable="w14 w15 w16se w16cid w16 w16cex w16sdtdh w16sdtfl w16du wp14">
-  <w15:commentEx w15:paraId="44E31EEA" w15:done="0"/>
-</w15:commentsEx>
-</file>
-
-<file path=word/commentsExtensible.xml><?xml version="1.0" encoding="utf-8"?>
-<w16cex:commentsExtensible xmlns:wpc="http://schemas.microsoft.com/office/word/2010/wordprocessingCanvas" xmlns:cx="http://schemas.microsoft.com/office/drawing/2014/chartex" xmlns:cx1="http://schemas.microsoft.com/office/drawing/2015/9/8/chartex" xmlns:cx2="http://schemas.microsoft.com/office/drawing/2015/10/21/chartex" xmlns:cx3="http://schemas.microsoft.com/office/drawing/2016/5/9/chartex" xmlns:cx4="http://schemas.microsoft.com/office/drawing/2016/5/10/chartex" xmlns:cx5="http://schemas.microsoft.com/office/drawing/2016/5/11/chartex" xmlns:cx6="http://schemas.microsoft.com/office/drawing/2016/5/12/chartex" xmlns:cx7="http://schemas.microsoft.com/office/drawing/2016/5/13/chartex" xmlns:cx8="http://schemas.microsoft.com/office/drawing/2016/5/14/chartex" xmlns:cr="http://schemas.microsoft.com/office/comments/2020/reactions" xmlns:mc="http://schemas.openxmlformats.org/markup-compatibility/2006" xmlns:aink="http://schemas.microsoft.com/office/drawing/2016/ink" xmlns:am3d="http://schemas.microsoft.com/office/drawing/2017/model3d" xmlns:o="urn:schemas-microsoft-com:office:office" xmlns:oel="http://schemas.microsoft.com/office/2019/extlst" xmlns:r="http://schemas.openxmlformats.org/officeDocument/2006/relationships" xmlns:m="http://schemas.openxmlformats.org/officeDocument/2006/math" xmlns:v="urn:schemas-microsoft-com:vml" xmlns:wp14="http://schemas.microsoft.com/office/word/2010/wordprocessingDrawing" xmlns:wp="http://schemas.openxmlformats.org/drawingml/2006/wordprocessingDrawing" xmlns:w10="urn:schemas-microsoft-com:office:word" xmlns:w="http://schemas.openxmlformats.org/wordprocessingml/2006/main" xmlns:w14="http://schemas.microsoft.com/office/word/2010/wordml" xmlns:w15="http://schemas.microsoft.com/office/word/2012/wordml" xmlns:w16cex="http://schemas.microsoft.com/office/word/2018/wordml/cex" xmlns:w16cid="http://schemas.microsoft.com/office/word/2016/wordml/cid" xmlns:w16="http://schemas.microsoft.com/office/word/2018/wordml" xmlns:w16du="http://schemas.microsoft.com/office/word/2023/wordml/word16du" xmlns:w16sdtdh="http://schemas.microsoft.com/office/word/2020/wordml/sdtdatahash" xmlns:w16sdtfl="http://schemas.microsoft.com/office/word/2024/wordml/sdtformatlock" xmlns:w16se="http://schemas.microsoft.com/office/word/2015/wordml/symex" xmlns:wpg="http://schemas.microsoft.com/office/word/2010/wordprocessingGroup" xmlns:wpi="http://schemas.microsoft.com/office/word/2010/wordprocessingInk" xmlns:wne="http://schemas.microsoft.com/office/word/2006/wordml" xmlns:wps="http://schemas.microsoft.com/office/word/2010/wordprocessingShape" mc:Ignorable="w14 w15 w16se w16cid w16 w16cex w16sdtdh w16sdtfl cr w16du wp14">
-  <w16cex:commentExtensible w16cex:durableId="7967E8CD" w16cex:dateUtc="2026-03-28T17:02:00Z"/>
-</w16cex:commentsExtensible>
-</file>
-
-<file path=word/commentsIds.xml><?xml version="1.0" encoding="utf-8"?>
-<w16cid:commentsIds xmlns:wpc="http://schemas.microsoft.com/office/word/2010/wordprocessingCanvas" xmlns:cx="http://schemas.microsoft.com/office/drawing/2014/chartex" xmlns:cx1="http://schemas.microsoft.com/office/drawing/2015/9/8/chartex" xmlns:cx2="http://schemas.microsoft.com/office/drawing/2015/10/21/chartex" xmlns:cx3="http://schemas.microsoft.com/office/drawing/2016/5/9/chartex" xmlns:cx4="http://schemas.microsoft.com/office/drawing/2016/5/10/chartex" xmlns:cx5="http://schemas.microsoft.com/office/drawing/2016/5/11/chartex" xmlns:cx6="http://schemas.microsoft.com/office/drawing/2016/5/12/chartex" xmlns:cx7="http://schemas.microsoft.com/office/drawing/2016/5/13/chartex" xmlns:cx8="http://schemas.microsoft.com/office/drawing/2016/5/14/chartex" xmlns:mc="http://schemas.openxmlformats.org/markup-compatibility/2006" xmlns:aink="http://schemas.microsoft.com/office/drawing/2016/ink" xmlns:am3d="http://schemas.microsoft.com/office/drawing/2017/model3d" xmlns:o="urn:schemas-microsoft-com:office:office" xmlns:oel="http://schemas.microsoft.com/office/2019/extlst" xmlns:r="http://schemas.openxmlformats.org/officeDocument/2006/relationships" xmlns:m="http://schemas.openxmlformats.org/officeDocument/2006/math" xmlns:v="urn:schemas-microsoft-com:vml" xmlns:wp14="http://schemas.microsoft.com/office/word/2010/wordprocessingDrawing" xmlns:wp="http://schemas.openxmlformats.org/drawingml/2006/wordprocessingDrawing" xmlns:w10="urn:schemas-microsoft-com:office:word" xmlns:w="http://schemas.openxmlformats.org/wordprocessingml/2006/main" xmlns:w14="http://schemas.microsoft.com/office/word/2010/wordml" xmlns:w15="http://schemas.microsoft.com/office/word/2012/wordml" xmlns:w16cex="http://schemas.microsoft.com/office/word/2018/wordml/cex" xmlns:w16cid="http://schemas.microsoft.com/office/word/2016/wordml/cid" xmlns:w16="http://schemas.microsoft.com/office/word/2018/wordml" xmlns:w16du="http://schemas.microsoft.com/office/word/2023/wordml/word16du" xmlns:w16sdtdh="http://schemas.microsoft.com/office/word/2020/wordml/sdtdatahash" xmlns:w16sdtfl="http://schemas.microsoft.com/office/word/2024/wordml/sdtformatlock" xmlns:w16se="http://schemas.microsoft.com/office/word/2015/wordml/symex" xmlns:wpg="http://schemas.microsoft.com/office/word/2010/wordprocessingGroup" xmlns:wpi="http://schemas.microsoft.com/office/word/2010/wordprocessingInk" xmlns:wne="http://schemas.microsoft.com/office/word/2006/wordml" xmlns:wps="http://schemas.microsoft.com/office/word/2010/wordprocessingShape" mc:Ignorable="w14 w15 w16se w16cid w16 w16cex w16sdtdh w16sdtfl w16du wp14">
-  <w16cid:commentId w16cid:paraId="44E31EEA" w16cid:durableId="7967E8CD"/>
-</w16cid:commentsIds>
 </file>
 
 <file path=word/endnotes.xml><?xml version="1.0" encoding="utf-8"?>
@@ -2467,14 +2512,6 @@
     <w:abstractNumId w:val="0"/>
   </w:num>
 </w:numbering>
-</file>
-
-<file path=word/people.xml><?xml version="1.0" encoding="utf-8"?>
-<w15:people xmlns:wpc="http://schemas.microsoft.com/office/word/2010/wordprocessingCanvas" xmlns:cx="http://schemas.microsoft.com/office/drawing/2014/chartex" xmlns:cx1="http://schemas.microsoft.com/office/drawing/2015/9/8/chartex" xmlns:cx2="http://schemas.microsoft.com/office/drawing/2015/10/21/chartex" xmlns:cx3="http://schemas.microsoft.com/office/drawing/2016/5/9/chartex" xmlns:cx4="http://schemas.microsoft.com/office/drawing/2016/5/10/chartex" xmlns:cx5="http://schemas.microsoft.com/office/drawing/2016/5/11/chartex" xmlns:cx6="http://schemas.microsoft.com/office/drawing/2016/5/12/chartex" xmlns:cx7="http://schemas.microsoft.com/office/drawing/2016/5/13/chartex" xmlns:cx8="http://schemas.microsoft.com/office/drawing/2016/5/14/chartex" xmlns:mc="http://schemas.openxmlformats.org/markup-compatibility/2006" xmlns:aink="http://schemas.microsoft.com/office/drawing/2016/ink" xmlns:am3d="http://schemas.microsoft.com/office/drawing/2017/model3d" xmlns:o="urn:schemas-microsoft-com:office:office" xmlns:oel="http://schemas.microsoft.com/office/2019/extlst" xmlns:r="http://schemas.openxmlformats.org/officeDocument/2006/relationships" xmlns:m="http://schemas.openxmlformats.org/officeDocument/2006/math" xmlns:v="urn:schemas-microsoft-com:vml" xmlns:wp14="http://schemas.microsoft.com/office/word/2010/wordprocessingDrawing" xmlns:wp="http://schemas.openxmlformats.org/drawingml/2006/wordprocessingDrawing" xmlns:w10="urn:schemas-microsoft-com:office:word" xmlns:w="http://schemas.openxmlformats.org/wordprocessingml/2006/main" xmlns:w14="http://schemas.microsoft.com/office/word/2010/wordml" xmlns:w15="http://schemas.microsoft.com/office/word/2012/wordml" xmlns:w16cex="http://schemas.microsoft.com/office/word/2018/wordml/cex" xmlns:w16cid="http://schemas.microsoft.com/office/word/2016/wordml/cid" xmlns:w16="http://schemas.microsoft.com/office/word/2018/wordml" xmlns:w16du="http://schemas.microsoft.com/office/word/2023/wordml/word16du" xmlns:w16sdtdh="http://schemas.microsoft.com/office/word/2020/wordml/sdtdatahash" xmlns:w16sdtfl="http://schemas.microsoft.com/office/word/2024/wordml/sdtformatlock" xmlns:w16se="http://schemas.microsoft.com/office/word/2015/wordml/symex" xmlns:wpg="http://schemas.microsoft.com/office/word/2010/wordprocessingGroup" xmlns:wpi="http://schemas.microsoft.com/office/word/2010/wordprocessingInk" xmlns:wne="http://schemas.microsoft.com/office/word/2006/wordml" xmlns:wps="http://schemas.microsoft.com/office/word/2010/wordprocessingShape" mc:Ignorable="w14 w15 w16se w16cid w16 w16cex w16sdtdh w16sdtfl w16du wp14">
-  <w15:person w15:author="Jerry">
-    <w15:presenceInfo w15:providerId="None" w15:userId="Jerry"/>
-  </w15:person>
-</w15:people>
 </file>
 
 <file path=word/styles.xml><?xml version="1.0" encoding="utf-8"?>
@@ -3429,6 +3466,12 @@
 </file>
 
 <file path=customXml/item1.xml><?xml version="1.0" encoding="utf-8"?>
+<p:properties xmlns:p="http://schemas.microsoft.com/office/2006/metadata/properties" xmlns:xsi="http://www.w3.org/2001/XMLSchema-instance" xmlns:pc="http://schemas.microsoft.com/office/infopath/2007/PartnerControls">
+  <documentManagement/>
+</p:properties>
+</file>
+
+<file path=customXml/item2.xml><?xml version="1.0" encoding="utf-8"?>
 <?mso-contentType ?>
 <FormTemplates xmlns="http://schemas.microsoft.com/sharepoint/v3/contenttype/forms">
   <Display>DocumentLibraryForm</Display>
@@ -3437,17 +3480,7 @@
 </FormTemplates>
 </file>
 
-<file path=customXml/item2.xml><?xml version="1.0" encoding="utf-8"?>
-<p:properties xmlns:p="http://schemas.microsoft.com/office/2006/metadata/properties" xmlns:xsi="http://www.w3.org/2001/XMLSchema-instance" xmlns:pc="http://schemas.microsoft.com/office/infopath/2007/PartnerControls">
-  <documentManagement/>
-</p:properties>
-</file>
-
 <file path=customXml/item3.xml><?xml version="1.0" encoding="utf-8"?>
-<b:Sources xmlns:b="http://schemas.openxmlformats.org/officeDocument/2006/bibliography" xmlns="http://schemas.openxmlformats.org/officeDocument/2006/bibliography" SelectedStyle="\APA.XSL" StyleName="APA"/>
-</file>
-
-<file path=customXml/item4.xml><?xml version="1.0" encoding="utf-8"?>
 <ct:contentTypeSchema xmlns:ct="http://schemas.microsoft.com/office/2006/metadata/contentType" xmlns:ma="http://schemas.microsoft.com/office/2006/metadata/properties/metaAttributes" ct:_="" ma:_="" ma:contentTypeName="Document" ma:contentTypeID="0x01010033553FA8616F3A45AD369E275EA42271" ma:contentTypeVersion="11" ma:contentTypeDescription="Create a new document." ma:contentTypeScope="" ma:versionID="8eb4e0804d077bcc139b361cda3a640c">
   <xsd:schema xmlns:xsd="http://www.w3.org/2001/XMLSchema" xmlns:xs="http://www.w3.org/2001/XMLSchema" xmlns:p="http://schemas.microsoft.com/office/2006/metadata/properties" xmlns:ns3="371a10d4-9e19-41a9-948b-d1cca29b4cb6" xmlns:ns4="18dffc30-a361-43f0-bb4a-1f62e819a6f2" targetNamespace="http://schemas.microsoft.com/office/2006/metadata/properties" ma:root="true" ma:fieldsID="ac8e08ff64368403dfb4d2274f8d7465" ns3:_="" ns4:_="">
     <xsd:import namespace="371a10d4-9e19-41a9-948b-d1cca29b4cb6"/>
@@ -3656,15 +3689,11 @@
 </ct:contentTypeSchema>
 </file>
 
-<file path=customXml/itemProps1.xml><?xml version="1.0" encoding="utf-8"?>
-<ds:datastoreItem xmlns:ds="http://schemas.openxmlformats.org/officeDocument/2006/customXml" ds:itemID="{05D9BF79-26A9-4E9A-9793-4E28B04A02DC}">
-  <ds:schemaRefs>
-    <ds:schemaRef ds:uri="http://schemas.microsoft.com/sharepoint/v3/contenttype/forms"/>
-  </ds:schemaRefs>
-</ds:datastoreItem>
+<file path=customXml/item4.xml><?xml version="1.0" encoding="utf-8"?>
+<b:Sources xmlns:b="http://schemas.openxmlformats.org/officeDocument/2006/bibliography" xmlns="http://schemas.openxmlformats.org/officeDocument/2006/bibliography" SelectedStyle="\APA.XSL" StyleName="APA"/>
 </file>
 
-<file path=customXml/itemProps2.xml><?xml version="1.0" encoding="utf-8"?>
+<file path=customXml/itemProps1.xml><?xml version="1.0" encoding="utf-8"?>
 <ds:datastoreItem xmlns:ds="http://schemas.openxmlformats.org/officeDocument/2006/customXml" ds:itemID="{10A8F88B-6E38-47A8-8074-155E10D59BDF}">
   <ds:schemaRefs>
     <ds:schemaRef ds:uri="http://schemas.microsoft.com/office/2006/metadata/properties"/>
@@ -3673,15 +3702,15 @@
 </ds:datastoreItem>
 </file>
 
-<file path=customXml/itemProps3.xml><?xml version="1.0" encoding="utf-8"?>
-<ds:datastoreItem xmlns:ds="http://schemas.openxmlformats.org/officeDocument/2006/customXml" ds:itemID="{79CEDF70-F74C-4284-98FC-38644A27E791}">
+<file path=customXml/itemProps2.xml><?xml version="1.0" encoding="utf-8"?>
+<ds:datastoreItem xmlns:ds="http://schemas.openxmlformats.org/officeDocument/2006/customXml" ds:itemID="{05D9BF79-26A9-4E9A-9793-4E28B04A02DC}">
   <ds:schemaRefs>
-    <ds:schemaRef ds:uri="http://schemas.openxmlformats.org/officeDocument/2006/bibliography"/>
+    <ds:schemaRef ds:uri="http://schemas.microsoft.com/sharepoint/v3/contenttype/forms"/>
   </ds:schemaRefs>
 </ds:datastoreItem>
 </file>
 
-<file path=customXml/itemProps4.xml><?xml version="1.0" encoding="utf-8"?>
+<file path=customXml/itemProps3.xml><?xml version="1.0" encoding="utf-8"?>
 <ds:datastoreItem xmlns:ds="http://schemas.openxmlformats.org/officeDocument/2006/customXml" ds:itemID="{307A6BE8-0D48-4A7D-A535-369CCDFBF2CB}">
   <ds:schemaRefs>
     <ds:schemaRef ds:uri="http://schemas.microsoft.com/office/2006/metadata/contentType"/>
@@ -3698,4 +3727,12 @@
     <ds:schemaRef ds:uri="http://schemas.microsoft.com/internal/obd"/>
   </ds:schemaRefs>
 </ds:datastoreItem>
+</file>
+
+<file path=customXml/itemProps4.xml><?xml version="1.0" encoding="utf-8"?>
+<ds:datastoreItem xmlns:ds="http://schemas.openxmlformats.org/officeDocument/2006/customXml" ds:itemID="{79CEDF70-F74C-4284-98FC-38644A27E791}">
+  <ds:schemaRefs>
+    <ds:schemaRef ds:uri="http://schemas.openxmlformats.org/officeDocument/2006/bibliography"/>
+  </ds:schemaRefs>
+</ds:datastoreItem>
 </file>
</xml_diff>